<commit_message>
language expressions improved, #179
</commit_message>
<xml_diff>
--- a/docs/documentation-de.docx
+++ b/docs/documentation-de.docx
@@ -512,7 +512,15 @@
           <w:sz w:val="20"/>
           <w:szCs w:val="20"/>
         </w:rPr>
-        <w:t>März 2026</w:t>
+        <w:t>August</w:t>
+      </w:r>
+      <w:r>
+        <w:rPr>
+          <w:rFonts w:cs="Malgun Gothic"/>
+          <w:sz w:val="20"/>
+          <w:szCs w:val="20"/>
+        </w:rPr>
+        <w:t xml:space="preserve"> 2026</w:t>
       </w:r>
     </w:p>
     <w:p>
@@ -808,7 +816,7 @@
     </w:p>
     <w:p>
       <w:pPr>
-        <w:pStyle w:val="Verzeichnisuser"/>
+        <w:pStyle w:val="Verzeichnis"/>
         <w:rPr/>
       </w:pPr>
       <w:r>
@@ -822,7 +830,7 @@
     </w:p>
     <w:p>
       <w:pPr>
-        <w:pStyle w:val="Verzeichnisuser"/>
+        <w:pStyle w:val="Verzeichnis"/>
         <w:rPr/>
       </w:pPr>
       <w:r>
@@ -1005,14 +1013,14 @@
           <w:sz w:val="20"/>
           <w:szCs w:val="20"/>
         </w:rPr>
-        <w:t xml:space="preserve">Seit 2011 sind mittlerweile </w:t>
-      </w:r>
-      <w:r>
-        <w:rPr>
-          <w:sz w:val="20"/>
-          <w:szCs w:val="20"/>
-        </w:rPr>
-        <w:t>51</w:t>
+        <w:t>Seit 2011 sind mittlerweile 5</w:t>
+      </w:r>
+      <w:r>
+        <w:rPr>
+          <w:sz w:val="20"/>
+          <w:szCs w:val="20"/>
+        </w:rPr>
+        <w:t>2</w:t>
       </w:r>
       <w:r>
         <w:rPr>
@@ -1075,7 +1083,7 @@
           <w:sz w:val="20"/>
           <w:szCs w:val="20"/>
         </w:rPr>
-        <w:t>2</w:t>
+        <w:t>3</w:t>
       </w:r>
       <w:r>
         <w:rPr>
@@ -3653,7 +3661,7 @@
     </w:sdt>
     <w:p>
       <w:pPr>
-        <w:pStyle w:val="Verzeichnisuser"/>
+        <w:pStyle w:val="Verzeichnis"/>
         <w:rPr>
           <w:rFonts w:ascii="Arial" w:hAnsi="Arial"/>
           <w:sz w:val="20"/>
@@ -4869,7 +4877,7 @@
           <w:szCs w:val="20"/>
         </w:rPr>
         <w:drawing>
-          <wp:anchor behindDoc="0" distT="0" distB="0" distL="0" distR="0" simplePos="0" locked="0" layoutInCell="0" allowOverlap="1" relativeHeight="5">
+          <wp:anchor distT="0" distB="0" distL="0" distR="0" simplePos="0" relativeHeight="5" behindDoc="0" locked="0" layoutInCell="0" allowOverlap="1">
             <wp:simplePos x="0" y="0"/>
             <wp:positionH relativeFrom="column">
               <wp:posOffset>344805</wp:posOffset>
@@ -4978,7 +4986,7 @@
         <w:bidi w:val="0"/>
         <w:jc w:val="both"/>
         <w:rPr>
-          <w:ins w:id="19" w:author="Unbekannter Autor" w:date="2024-10-13T20:57:08Z"/>
+          <w:ins w:id="21" w:author="Unbekannter Autor" w:date="2024-10-13T20:57:08Z"/>
         </w:rPr>
       </w:pPr>
       <w:r>
@@ -4994,10 +5002,26 @@
             <w:sz w:val="20"/>
             <w:szCs w:val="20"/>
           </w:rPr>
-          <w:t>die Installationsroutine des Plugins aufgerufen werden.Dazu</w:t>
+          <w:t>die Installationsroutine des Plugins aufgerufen werden.</w:t>
         </w:r>
       </w:ins>
-      <w:del w:id="15" w:author="Unbekannter Autor" w:date="2024-10-13T20:56:28Z">
+      <w:r>
+        <w:rPr>
+          <w:sz w:val="20"/>
+          <w:szCs w:val="20"/>
+        </w:rPr>
+        <w:t xml:space="preserve"> </w:t>
+      </w:r>
+      <w:ins w:id="15" w:author="Unbekannter Autor" w:date="2024-10-13T20:55:34Z">
+        <w:r>
+          <w:rPr>
+            <w:sz w:val="20"/>
+            <w:szCs w:val="20"/>
+          </w:rPr>
+          <w:t>Dazu</w:t>
+        </w:r>
+      </w:ins>
+      <w:del w:id="16" w:author="Unbekannter Autor" w:date="2024-10-13T20:56:28Z">
         <w:r>
           <w:rPr>
             <w:sz w:val="20"/>
@@ -5008,16 +5032,39 @@
           <w:delText>punkt erstellt werden</w:delText>
         </w:r>
       </w:del>
-      <w:ins w:id="16" w:author="Unbekannter Autor" w:date="2024-10-13T21:05:47Z">
+      <w:ins w:id="17" w:author="Unbekannter Autor" w:date="2024-10-13T21:05:47Z">
         <w:r>
           <w:rPr>
             <w:sz w:val="20"/>
             <w:szCs w:val="20"/>
           </w:rPr>
-          <w:t xml:space="preserve"> in Admidio einloggen und</w:t>
+          <w:t xml:space="preserve"> in Admidio einloggen</w:t>
         </w:r>
       </w:ins>
-      <w:ins w:id="17" w:author="Unbekannter Autor" w:date="2024-10-13T20:56:30Z">
+      <w:r>
+        <w:rPr>
+          <w:sz w:val="20"/>
+          <w:szCs w:val="20"/>
+        </w:rPr>
+        <w:t xml:space="preserve">, </w:t>
+      </w:r>
+      <w:r>
+        <w:rPr>
+          <w:sz w:val="20"/>
+          <w:szCs w:val="20"/>
+        </w:rPr>
+        <w:t>in einer vorhandenen Rolle einen Beitrag und einen Beitragszeitraum eintragen</w:t>
+      </w:r>
+      <w:ins w:id="18" w:author="Unbekannter Autor" w:date="2024-10-13T21:05:47Z">
+        <w:r>
+          <w:rPr>
+            <w:sz w:val="20"/>
+            <w:szCs w:val="20"/>
+          </w:rPr>
+          <w:t xml:space="preserve"> und</w:t>
+        </w:r>
+      </w:ins>
+      <w:ins w:id="19" w:author="Unbekannter Autor" w:date="2024-10-13T20:56:30Z">
         <w:r>
           <w:rPr>
             <w:sz w:val="20"/>
@@ -5026,7 +5073,7 @@
           <w:t xml:space="preserve"> im Browser folgende PHP-Datei starten:</w:t>
         </w:r>
       </w:ins>
-      <w:del w:id="18" w:author="Unbekannter Autor" w:date="2024-10-13T20:57:03Z">
+      <w:del w:id="20" w:author="Unbekannter Autor" w:date="2024-10-13T20:57:03Z">
         <w:r>
           <w:rPr>
             <w:sz w:val="20"/>
@@ -5042,12 +5089,12 @@
         <w:bidi w:val="0"/>
         <w:jc w:val="both"/>
         <w:rPr>
-          <w:ins w:id="21" w:author="Unbekannter Autor" w:date="2024-10-13T20:57:08Z"/>
-          <w:sz w:val="20"/>
-          <w:szCs w:val="20"/>
-        </w:rPr>
-      </w:pPr>
-      <w:ins w:id="20" w:author="Unbekannter Autor" w:date="2024-10-13T20:57:08Z">
+          <w:ins w:id="23" w:author="Unbekannter Autor" w:date="2024-10-13T20:57:08Z"/>
+          <w:sz w:val="20"/>
+          <w:szCs w:val="20"/>
+        </w:rPr>
+      </w:pPr>
+      <w:ins w:id="22" w:author="Unbekannter Autor" w:date="2024-10-13T20:57:08Z">
         <w:r>
           <w:rPr>
             <w:sz w:val="20"/>
@@ -5062,10 +5109,10 @@
         <w:bidi w:val="0"/>
         <w:jc w:val="both"/>
         <w:rPr>
-          <w:ins w:id="25" w:author="Unbekannter Autor" w:date="2024-10-13T20:57:08Z"/>
-        </w:rPr>
-      </w:pPr>
-      <w:ins w:id="22" w:author="Unbekannter Autor" w:date="2024-10-13T20:57:08Z">
+          <w:ins w:id="27" w:author="Unbekannter Autor" w:date="2024-10-13T20:57:08Z"/>
+        </w:rPr>
+      </w:pPr>
+      <w:ins w:id="24" w:author="Unbekannter Autor" w:date="2024-10-13T20:57:08Z">
         <w:r>
           <w:rPr>
             <w:sz w:val="20"/>
@@ -5083,7 +5130,7 @@
         <w:softHyphen/>
         <w:t>shipFee</w:t>
       </w:r>
-      <w:ins w:id="23" w:author="Unbekannter Autor" w:date="2024-10-13T20:57:08Z">
+      <w:ins w:id="25" w:author="Unbekannter Autor" w:date="2024-10-13T20:57:08Z">
         <w:r>
           <w:rPr>
             <w:sz w:val="20"/>
@@ -5099,7 +5146,7 @@
         </w:rPr>
         <w:t>system/install</w:t>
       </w:r>
-      <w:ins w:id="24" w:author="Unbekannter Autor" w:date="2024-10-13T20:57:08Z">
+      <w:ins w:id="26" w:author="Unbekannter Autor" w:date="2024-10-13T20:57:08Z">
         <w:r>
           <w:rPr>
             <w:sz w:val="20"/>
@@ -5115,26 +5162,6 @@
         <w:bidi w:val="0"/>
         <w:jc w:val="both"/>
         <w:rPr>
-          <w:ins w:id="27" w:author="Unbekannter Autor" w:date="2024-10-13T20:57:08Z"/>
-          <w:sz w:val="20"/>
-          <w:szCs w:val="20"/>
-        </w:rPr>
-      </w:pPr>
-      <w:ins w:id="26" w:author="Unbekannter Autor" w:date="2024-10-13T20:57:08Z">
-        <w:r>
-          <w:rPr>
-            <w:sz w:val="20"/>
-            <w:szCs w:val="20"/>
-          </w:rPr>
-        </w:r>
-      </w:ins>
-    </w:p>
-    <w:p>
-      <w:pPr>
-        <w:pStyle w:val="Normal"/>
-        <w:bidi w:val="0"/>
-        <w:jc w:val="both"/>
-        <w:rPr>
           <w:ins w:id="29" w:author="Unbekannter Autor" w:date="2024-10-13T20:57:08Z"/>
           <w:sz w:val="20"/>
           <w:szCs w:val="20"/>
@@ -5151,6 +5178,26 @@
     </w:p>
     <w:p>
       <w:pPr>
+        <w:pStyle w:val="Normal"/>
+        <w:bidi w:val="0"/>
+        <w:jc w:val="both"/>
+        <w:rPr>
+          <w:ins w:id="31" w:author="Unbekannter Autor" w:date="2024-10-13T20:57:08Z"/>
+          <w:sz w:val="20"/>
+          <w:szCs w:val="20"/>
+        </w:rPr>
+      </w:pPr>
+      <w:ins w:id="30" w:author="Unbekannter Autor" w:date="2024-10-13T20:57:08Z">
+        <w:r>
+          <w:rPr>
+            <w:sz w:val="20"/>
+            <w:szCs w:val="20"/>
+          </w:rPr>
+        </w:r>
+      </w:ins>
+    </w:p>
+    <w:p>
+      <w:pPr>
         <w:pStyle w:val="Heading2"/>
         <w:numPr>
           <w:ilvl w:val="0"/>
@@ -5159,14 +5206,14 @@
         <w:ind w:hanging="0" w:left="0"/>
         <w:jc w:val="both"/>
         <w:rPr>
-          <w:del w:id="31" w:author="Unbekannter Autor" w:date="2024-10-13T21:10:46Z"/>
+          <w:del w:id="33" w:author="Unbekannter Autor" w:date="2024-10-13T21:10:46Z"/>
           <w:i w:val="false"/>
           <w:iCs w:val="false"/>
           <w:sz w:val="20"/>
           <w:szCs w:val="20"/>
         </w:rPr>
       </w:pPr>
-      <w:del w:id="30" w:author="Unbekannter Autor" w:date="2024-10-13T21:10:46Z">
+      <w:del w:id="32" w:author="Unbekannter Autor" w:date="2024-10-13T21:10:46Z">
         <w:r>
           <w:rPr>
             <w:i w:val="false"/>
@@ -5186,17 +5233,17 @@
           <w:numId w:val="3"/>
         </w:numPr>
         <w:suppressAutoHyphens w:val="true"/>
-        <w:overflowPunct w:val="true"/>
+        <w:overflowPunct w:val="false"/>
         <w:bidi w:val="0"/>
         <w:spacing w:before="0" w:after="0"/>
         <w:jc w:val="both"/>
         <w:rPr>
-          <w:del w:id="33" w:author="Unbekannter Autor" w:date="2024-10-13T21:10:46Z"/>
-          <w:sz w:val="20"/>
-          <w:szCs w:val="20"/>
-        </w:rPr>
-      </w:pPr>
-      <w:del w:id="32" w:author="Unbekannter Autor" w:date="2024-10-13T21:10:46Z">
+          <w:del w:id="35" w:author="Unbekannter Autor" w:date="2024-10-13T21:10:46Z"/>
+          <w:sz w:val="20"/>
+          <w:szCs w:val="20"/>
+        </w:rPr>
+      </w:pPr>
+      <w:del w:id="34" w:author="Unbekannter Autor" w:date="2024-10-13T21:10:46Z">
         <w:r>
           <w:rPr>
             <w:sz w:val="20"/>
@@ -5214,20 +5261,20 @@
           <w:numId w:val="0"/>
         </w:numPr>
         <w:suppressAutoHyphens w:val="true"/>
-        <w:overflowPunct w:val="true"/>
+        <w:overflowPunct w:val="false"/>
         <w:bidi w:val="0"/>
         <w:spacing w:before="0" w:after="0"/>
         <w:ind w:hanging="0" w:left="0"/>
         <w:jc w:val="both"/>
         <w:rPr>
-          <w:del w:id="35" w:author="Unbekannter Autor" w:date="2024-10-13T23:04:38Z"/>
+          <w:del w:id="37" w:author="Unbekannter Autor" w:date="2024-10-13T23:04:38Z"/>
           <w:i w:val="false"/>
           <w:iCs w:val="false"/>
           <w:sz w:val="20"/>
           <w:szCs w:val="20"/>
         </w:rPr>
       </w:pPr>
-      <w:del w:id="34" w:author="Unbekannter Autor" w:date="2024-10-13T23:04:38Z">
+      <w:del w:id="36" w:author="Unbekannter Autor" w:date="2024-10-13T23:04:38Z">
         <w:r>
           <w:rPr>
             <w:i w:val="false"/>
@@ -5247,16 +5294,16 @@
           <w:numId w:val="3"/>
         </w:numPr>
         <w:suppressAutoHyphens w:val="true"/>
-        <w:overflowPunct w:val="true"/>
+        <w:overflowPunct w:val="false"/>
         <w:ind w:hanging="0" w:left="0"/>
         <w:jc w:val="left"/>
         <w:rPr>
-          <w:del w:id="37" w:author="Unbekannter Autor" w:date="2024-10-13T23:04:38Z"/>
-          <w:sz w:val="20"/>
-          <w:szCs w:val="20"/>
-        </w:rPr>
-      </w:pPr>
-      <w:del w:id="36" w:author="Unbekannter Autor" w:date="2024-10-13T23:04:38Z">
+          <w:del w:id="39" w:author="Unbekannter Autor" w:date="2024-10-13T23:04:38Z"/>
+          <w:sz w:val="20"/>
+          <w:szCs w:val="20"/>
+        </w:rPr>
+      </w:pPr>
+      <w:del w:id="38" w:author="Unbekannter Autor" w:date="2024-10-13T23:04:38Z">
         <w:r>
           <w:rPr>
             <w:sz w:val="20"/>
@@ -5277,18 +5324,18 @@
         </w:numPr>
         <w:spacing w:before="0" w:after="120"/>
         <w:rPr>
-          <w:del w:id="40" w:author="Unbekannter Autor" w:date="2024-10-13T23:04:14Z"/>
-          <w:sz w:val="20"/>
-          <w:szCs w:val="20"/>
-        </w:rPr>
-      </w:pPr>
-      <w:del w:id="38" w:author="Unbekannter Autor" w:date="2024-10-13T20:59:42Z">
+          <w:del w:id="42" w:author="Unbekannter Autor" w:date="2024-10-13T23:04:14Z"/>
+          <w:sz w:val="20"/>
+          <w:szCs w:val="20"/>
+        </w:rPr>
+      </w:pPr>
+      <w:del w:id="40" w:author="Unbekannter Autor" w:date="2024-10-13T20:59:42Z">
         <w:r>
           <w:rPr/>
           <w:delText xml:space="preserve">Erstellen eines </w:delText>
         </w:r>
       </w:del>
-      <w:del w:id="39" w:author="Unbekannter Autor" w:date="2024-10-13T23:04:14Z">
+      <w:del w:id="41" w:author="Unbekannter Autor" w:date="2024-10-13T23:04:14Z">
         <w:r>
           <w:rPr/>
           <w:delText>Menüpunktes</w:delText>
@@ -5305,17 +5352,17 @@
           <w:numId w:val="3"/>
         </w:numPr>
         <w:suppressAutoHyphens w:val="true"/>
-        <w:overflowPunct w:val="true"/>
+        <w:overflowPunct w:val="false"/>
         <w:bidi w:val="0"/>
         <w:spacing w:before="0" w:after="120"/>
         <w:jc w:val="left"/>
         <w:rPr>
-          <w:del w:id="42" w:author="Unbekannter Autor" w:date="2024-10-13T23:04:37Z"/>
-          <w:sz w:val="20"/>
-          <w:szCs w:val="20"/>
-        </w:rPr>
-      </w:pPr>
-      <w:del w:id="41" w:author="Unbekannter Autor" w:date="2024-10-13T21:11:17Z">
+          <w:del w:id="44" w:author="Unbekannter Autor" w:date="2024-10-13T23:04:37Z"/>
+          <w:sz w:val="20"/>
+          <w:szCs w:val="20"/>
+        </w:rPr>
+      </w:pPr>
+      <w:del w:id="43" w:author="Unbekannter Autor" w:date="2024-10-13T21:11:17Z">
         <w:r>
           <w:rPr>
             <w:i w:val="false"/>
@@ -5336,19 +5383,19 @@
           <w:numId w:val="3"/>
         </w:numPr>
         <w:suppressAutoHyphens w:val="true"/>
-        <w:overflowPunct w:val="true"/>
+        <w:overflowPunct w:val="false"/>
         <w:bidi w:val="0"/>
         <w:spacing w:before="0" w:after="0"/>
         <w:jc w:val="both"/>
         <w:rPr>
-          <w:del w:id="44" w:author="Unbekannter Autor" w:date="2024-10-13T23:04:37Z"/>
+          <w:del w:id="46" w:author="Unbekannter Autor" w:date="2024-10-13T23:04:37Z"/>
           <w:i w:val="false"/>
           <w:iCs w:val="false"/>
           <w:sz w:val="20"/>
           <w:szCs w:val="20"/>
         </w:rPr>
       </w:pPr>
-      <w:del w:id="43" w:author="Unbekannter Autor" w:date="2024-10-13T23:04:37Z">
+      <w:del w:id="45" w:author="Unbekannter Autor" w:date="2024-10-13T23:04:37Z">
         <w:r>
           <w:rPr>
             <w:i w:val="false"/>
@@ -5369,10 +5416,10 @@
         <w:bidi w:val="0"/>
         <w:jc w:val="both"/>
         <w:rPr>
-          <w:del w:id="48" w:author="Unbekannter Autor" w:date="2024-10-13T23:04:37Z"/>
-        </w:rPr>
-      </w:pPr>
-      <w:del w:id="45" w:author="Unbekannter Autor" w:date="2024-10-13T23:04:37Z">
+          <w:del w:id="50" w:author="Unbekannter Autor" w:date="2024-10-13T23:04:37Z"/>
+        </w:rPr>
+      </w:pPr>
+      <w:del w:id="47" w:author="Unbekannter Autor" w:date="2024-10-13T23:04:37Z">
         <w:r>
           <w:rPr>
             <w:i w:val="false"/>
@@ -5383,7 +5430,7 @@
           <w:delText xml:space="preserve">Es wird </w:delText>
         </w:r>
       </w:del>
-      <w:del w:id="46" w:author="Unbekannter Autor" w:date="2024-10-13T23:04:37Z">
+      <w:del w:id="48" w:author="Unbekannter Autor" w:date="2024-10-13T23:04:37Z">
         <w:r>
           <w:rPr>
             <w:rFonts w:eastAsia="NSimSun" w:cs="Arial"/>
@@ -5399,7 +5446,7 @@
           <w:delText>dringend empfohlen</w:delText>
         </w:r>
       </w:del>
-      <w:del w:id="47" w:author="Unbekannter Autor" w:date="2024-10-13T23:04:37Z">
+      <w:del w:id="49" w:author="Unbekannter Autor" w:date="2024-10-13T23:04:37Z">
         <w:r>
           <w:rPr>
             <w:i w:val="false"/>
@@ -5420,19 +5467,19 @@
           <w:numId w:val="3"/>
         </w:numPr>
         <w:suppressAutoHyphens w:val="true"/>
-        <w:overflowPunct w:val="true"/>
+        <w:overflowPunct w:val="false"/>
         <w:bidi w:val="0"/>
         <w:spacing w:before="0" w:after="0"/>
         <w:jc w:val="both"/>
         <w:rPr>
-          <w:del w:id="50" w:author="Unbekannter Autor" w:date="2024-10-13T23:04:37Z"/>
+          <w:del w:id="52" w:author="Unbekannter Autor" w:date="2024-10-13T23:04:37Z"/>
           <w:i w:val="false"/>
           <w:iCs w:val="false"/>
           <w:sz w:val="20"/>
           <w:szCs w:val="20"/>
         </w:rPr>
       </w:pPr>
-      <w:del w:id="49" w:author="Unbekannter Autor" w:date="2024-10-13T23:04:37Z">
+      <w:del w:id="51" w:author="Unbekannter Autor" w:date="2024-10-13T23:04:37Z">
         <w:r>
           <w:rPr>
             <w:i w:val="false"/>
@@ -5453,10 +5500,10 @@
         <w:bidi w:val="0"/>
         <w:jc w:val="both"/>
         <w:rPr>
-          <w:del w:id="52" w:author="Unbekannter Autor" w:date="2024-10-13T23:04:37Z"/>
-        </w:rPr>
-      </w:pPr>
-      <w:del w:id="51" w:author="Unbekannter Autor" w:date="2024-10-13T23:04:37Z">
+          <w:del w:id="54" w:author="Unbekannter Autor" w:date="2024-10-13T23:04:37Z"/>
+        </w:rPr>
+      </w:pPr>
+      <w:del w:id="53" w:author="Unbekannter Autor" w:date="2024-10-13T23:04:37Z">
         <w:r>
           <w:rPr>
             <w:i w:val="false"/>
@@ -5481,19 +5528,19 @@
           <w:numId w:val="3"/>
         </w:numPr>
         <w:suppressAutoHyphens w:val="true"/>
-        <w:overflowPunct w:val="true"/>
+        <w:overflowPunct w:val="false"/>
         <w:bidi w:val="0"/>
         <w:spacing w:before="0" w:after="0"/>
         <w:jc w:val="both"/>
         <w:rPr>
-          <w:del w:id="54" w:author="Unbekannter Autor" w:date="2024-10-13T23:04:37Z"/>
+          <w:del w:id="56" w:author="Unbekannter Autor" w:date="2024-10-13T23:04:37Z"/>
           <w:i w:val="false"/>
           <w:iCs w:val="false"/>
           <w:sz w:val="20"/>
           <w:szCs w:val="20"/>
         </w:rPr>
       </w:pPr>
-      <w:del w:id="53" w:author="Unbekannter Autor" w:date="2024-10-13T23:04:37Z">
+      <w:del w:id="55" w:author="Unbekannter Autor" w:date="2024-10-13T23:04:37Z">
         <w:r>
           <w:rPr>
             <w:i w:val="false"/>
@@ -5514,10 +5561,10 @@
         <w:bidi w:val="0"/>
         <w:jc w:val="both"/>
         <w:rPr>
-          <w:del w:id="56" w:author="Unbekannter Autor" w:date="2024-10-13T23:04:37Z"/>
-        </w:rPr>
-      </w:pPr>
-      <w:del w:id="55" w:author="Unbekannter Autor" w:date="2024-10-13T23:04:37Z">
+          <w:del w:id="58" w:author="Unbekannter Autor" w:date="2024-10-13T23:04:37Z"/>
+        </w:rPr>
+      </w:pPr>
+      <w:del w:id="57" w:author="Unbekannter Autor" w:date="2024-10-13T23:04:37Z">
         <w:r>
           <w:rPr>
             <w:i w:val="false"/>
@@ -5539,13 +5586,13 @@
         <w:bidi w:val="0"/>
         <w:jc w:val="both"/>
         <w:rPr>
-          <w:del w:id="58" w:author="Unbekannter Autor" w:date="2024-10-13T23:04:37Z"/>
-          <w:rFonts w:ascii="Arial" w:hAnsi="Arial"/>
-          <w:sz w:val="20"/>
-          <w:szCs w:val="20"/>
-        </w:rPr>
-      </w:pPr>
-      <w:del w:id="57" w:author="Unbekannter Autor" w:date="2024-10-13T23:04:37Z">
+          <w:del w:id="60" w:author="Unbekannter Autor" w:date="2024-10-13T23:04:37Z"/>
+          <w:rFonts w:ascii="Arial" w:hAnsi="Arial"/>
+          <w:sz w:val="20"/>
+          <w:szCs w:val="20"/>
+        </w:rPr>
+      </w:pPr>
+      <w:del w:id="59" w:author="Unbekannter Autor" w:date="2024-10-13T23:04:37Z">
         <w:r>
           <w:rPr>
             <w:sz w:val="20"/>
@@ -5564,7 +5611,7 @@
         <w:ind w:hanging="0" w:left="0"/>
         <w:jc w:val="both"/>
         <w:rPr>
-          <w:ins w:id="60" w:author="Unbekannter Autor" w:date="2024-10-13T23:22:36Z"/>
+          <w:ins w:id="62" w:author="Unbekannter Autor" w:date="2024-10-13T23:22:36Z"/>
         </w:rPr>
       </w:pPr>
       <w:bookmarkStart w:id="4" w:name="__RefHeading___Toc6072_3742836152"/>
@@ -5573,7 +5620,7 @@
         <w:rPr/>
         <w:t>D</w:t>
       </w:r>
-      <w:ins w:id="59" w:author="Unbekannter Autor" w:date="2024-10-13T23:06:36Z">
+      <w:ins w:id="61" w:author="Unbekannter Autor" w:date="2024-10-13T23:06:36Z">
         <w:r>
           <w:rPr/>
           <w:t>ie Installationsroutine</w:t>
@@ -5585,10 +5632,10 @@
         <w:pStyle w:val="BodyText"/>
         <w:jc w:val="both"/>
         <w:rPr>
-          <w:ins w:id="62" w:author="Unbekannter Autor" w:date="2024-10-13T23:22:36Z"/>
-        </w:rPr>
-      </w:pPr>
-      <w:ins w:id="61" w:author="Unbekannter Autor" w:date="2024-10-13T23:22:36Z">
+          <w:ins w:id="64" w:author="Unbekannter Autor" w:date="2024-10-13T23:22:36Z"/>
+        </w:rPr>
+      </w:pPr>
+      <w:ins w:id="63" w:author="Unbekannter Autor" w:date="2024-10-13T23:22:36Z">
         <w:r>
           <w:rPr/>
         </w:r>
@@ -5602,10 +5649,10 @@
           <w:numId w:val="3"/>
         </w:numPr>
         <w:rPr>
-          <w:del w:id="64" w:author="Unbekannter Autor" w:date="2024-10-13T23:23:25Z"/>
-        </w:rPr>
-      </w:pPr>
-      <w:del w:id="63" w:author="Unbekannter Autor" w:date="2024-10-13T23:06:45Z">
+          <w:del w:id="66" w:author="Unbekannter Autor" w:date="2024-10-13T23:23:25Z"/>
+        </w:rPr>
+      </w:pPr>
+      <w:del w:id="65" w:author="Unbekannter Autor" w:date="2024-10-13T23:06:45Z">
         <w:r>
           <w:rPr/>
           <w:delText>er erste Aufruf</w:delText>
@@ -5621,13 +5668,13 @@
         </w:numPr>
         <w:rPr/>
       </w:pPr>
-      <w:ins w:id="65" w:author="Unbekannter Autor" w:date="2024-10-13T23:13:34Z">
+      <w:ins w:id="67" w:author="Unbekannter Autor" w:date="2024-10-13T23:13:34Z">
         <w:r>
           <w:rPr/>
           <w:t xml:space="preserve">Durch Starten der install.php wird ein Installationsprozess angestoßen, der alle </w:t>
         </w:r>
       </w:ins>
-      <w:ins w:id="66" w:author="Unbekannter Autor" w:date="2024-10-13T23:13:34Z">
+      <w:ins w:id="68" w:author="Unbekannter Autor" w:date="2024-10-13T23:13:34Z">
         <w:r>
           <w:rPr>
             <w:sz w:val="20"/>
@@ -5638,7 +5685,7 @@
           <w:t>der und Kategorien anlegt.</w:t>
         </w:r>
       </w:ins>
-      <w:ins w:id="67" w:author="Unbekannter Autor" w:date="2024-10-13T23:13:34Z">
+      <w:ins w:id="69" w:author="Unbekannter Autor" w:date="2024-10-13T23:13:34Z">
         <w:r>
           <w:rPr/>
           <w:t xml:space="preserve"> </w:t>
@@ -5656,12 +5703,12 @@
       <w:pPr>
         <w:pStyle w:val="BodyText"/>
         <w:rPr>
-          <w:del w:id="73" w:author="Unbekannter Autor" w:date="2024-10-13T23:24:11Z"/>
-          <w:sz w:val="20"/>
-          <w:szCs w:val="20"/>
-        </w:rPr>
-      </w:pPr>
-      <w:ins w:id="68" w:author="Unbekannter Autor" w:date="2024-10-13T23:14:49Z">
+          <w:del w:id="75" w:author="Unbekannter Autor" w:date="2024-10-13T23:24:11Z"/>
+          <w:sz w:val="20"/>
+          <w:szCs w:val="20"/>
+        </w:rPr>
+      </w:pPr>
+      <w:ins w:id="70" w:author="Unbekannter Autor" w:date="2024-10-13T23:14:49Z">
         <w:r>
           <w:rPr>
             <w:sz w:val="20"/>
@@ -5670,7 +5717,7 @@
           <w:t>Zu</w:t>
         </w:r>
       </w:ins>
-      <w:ins w:id="69" w:author="Unbekannter Autor" w:date="2024-10-13T23:15:50Z">
+      <w:ins w:id="71" w:author="Unbekannter Autor" w:date="2024-10-13T23:15:50Z">
         <w:r>
           <w:rPr>
             <w:sz w:val="20"/>
@@ -5686,7 +5733,7 @@
         </w:rPr>
         <w:t>wird bei jedem Start des Plugins ge</w:t>
       </w:r>
-      <w:ins w:id="70" w:author="Unbekannter Autor" w:date="2024-10-13T23:15:50Z">
+      <w:ins w:id="72" w:author="Unbekannter Autor" w:date="2024-10-13T23:15:50Z">
         <w:r>
           <w:rPr>
             <w:sz w:val="20"/>
@@ -5704,7 +5751,7 @@
         <w:softHyphen/>
         <w:t xml:space="preserve">cherten </w:t>
       </w:r>
-      <w:ins w:id="71" w:author="Unbekannter Autor" w:date="2024-10-13T23:21:09Z">
+      <w:ins w:id="73" w:author="Unbekannter Autor" w:date="2024-10-13T23:21:09Z">
         <w:r>
           <w:rPr>
             <w:sz w:val="20"/>
@@ -5713,7 +5760,7 @@
           <w:t>Werten</w:t>
         </w:r>
       </w:ins>
-      <w:del w:id="72" w:author="Unbekannter Autor" w:date="2024-10-13T23:21:12Z">
+      <w:del w:id="74" w:author="Unbekannter Autor" w:date="2024-10-13T23:21:12Z">
         <w:r>
           <w:rPr>
             <w:sz w:val="20"/>
@@ -5751,7 +5798,7 @@
         <w:bidi w:val="0"/>
         <w:jc w:val="both"/>
         <w:rPr>
-          <w:del w:id="81" w:author="Unbekannter Autor" w:date="2024-10-13T23:22:39Z"/>
+          <w:del w:id="83" w:author="Unbekannter Autor" w:date="2024-10-13T23:22:39Z"/>
           <w:sz w:val="20"/>
           <w:szCs w:val="20"/>
         </w:rPr>
@@ -5763,7 +5810,7 @@
         </w:rPr>
         <w:t>Bei Unterschiedlichkeit wird ein detaillierter</w:t>
       </w:r>
-      <w:del w:id="74" w:author="Unbekannter Autor" w:date="2024-10-13T23:16:42Z">
+      <w:del w:id="76" w:author="Unbekannter Autor" w:date="2024-10-13T23:16:42Z">
         <w:r>
           <w:rPr>
             <w:sz w:val="20"/>
@@ -5779,7 +5826,7 @@
         </w:rPr>
         <w:t xml:space="preserve"> </w:t>
       </w:r>
-      <w:ins w:id="75" w:author="Unbekannter Autor" w:date="2024-10-13T23:16:42Z">
+      <w:ins w:id="77" w:author="Unbekannter Autor" w:date="2024-10-13T23:16:42Z">
         <w:r>
           <w:rPr>
             <w:sz w:val="20"/>
@@ -5797,7 +5844,7 @@
         <w:softHyphen/>
         <w:t>führt</w:t>
       </w:r>
-      <w:ins w:id="76" w:author="Unbekannter Autor" w:date="2024-10-13T23:21:22Z">
+      <w:ins w:id="78" w:author="Unbekannter Autor" w:date="2024-10-13T23:21:22Z">
         <w:r>
           <w:rPr>
             <w:sz w:val="20"/>
@@ -5806,7 +5853,7 @@
           <w:t>. D</w:t>
         </w:r>
       </w:ins>
-      <w:ins w:id="77" w:author="Unbekannter Autor" w:date="2024-10-13T23:19:40Z">
+      <w:ins w:id="79" w:author="Unbekannter Autor" w:date="2024-10-13T23:19:40Z">
         <w:r>
           <w:rPr>
             <w:sz w:val="20"/>
@@ -5815,7 +5862,7 @@
           <w:t xml:space="preserve">abei </w:t>
         </w:r>
       </w:ins>
-      <w:ins w:id="78" w:author="Unbekannter Autor" w:date="2024-10-13T23:30:52Z">
+      <w:ins w:id="80" w:author="Unbekannter Autor" w:date="2024-10-13T23:30:52Z">
         <w:r>
           <w:rPr>
             <w:sz w:val="20"/>
@@ -5824,7 +5871,7 @@
           <w:t>können</w:t>
         </w:r>
       </w:ins>
-      <w:ins w:id="79" w:author="Unbekannter Autor" w:date="2024-10-13T23:17:44Z">
+      <w:ins w:id="81" w:author="Unbekannter Autor" w:date="2024-10-13T23:17:44Z">
         <w:r>
           <w:rPr>
             <w:sz w:val="20"/>
@@ -5835,7 +5882,7 @@
           <w:t>schrieben werden.</w:t>
         </w:r>
       </w:ins>
-      <w:del w:id="80" w:author="Unbekannter Autor" w:date="2024-10-13T23:17:43Z">
+      <w:del w:id="82" w:author="Unbekannter Autor" w:date="2024-10-13T23:17:43Z">
         <w:r>
           <w:rPr>
             <w:sz w:val="20"/>
@@ -5855,7 +5902,7 @@
           <w:szCs w:val="20"/>
         </w:rPr>
       </w:pPr>
-      <w:del w:id="82" w:author="Unbekannter Autor" w:date="2024-10-13T23:21:38Z">
+      <w:del w:id="84" w:author="Unbekannter Autor" w:date="2024-10-13T23:21:38Z">
         <w:r>
           <w:rPr>
             <w:sz w:val="20"/>
@@ -5871,31 +5918,6 @@
       <w:pPr>
         <w:pStyle w:val="Normal"/>
         <w:bidi w:val="0"/>
-        <w:jc w:val="both"/>
-        <w:rPr>
-          <w:ins w:id="84" w:author="Unbekannter Autor" w:date="2024-10-13T23:22:19Z"/>
-          <w:rFonts w:ascii="Arial" w:hAnsi="Arial"/>
-          <w:sz w:val="20"/>
-          <w:szCs w:val="20"/>
-        </w:rPr>
-      </w:pPr>
-      <w:ins w:id="83" w:author="Unbekannter Autor" w:date="2024-10-13T23:22:19Z">
-        <w:r>
-          <w:rPr>
-            <w:sz w:val="20"/>
-            <w:szCs w:val="20"/>
-          </w:rPr>
-        </w:r>
-      </w:ins>
-      <w:r>
-        <w:br w:type="page"/>
-      </w:r>
-    </w:p>
-    <w:p>
-      <w:pPr>
-        <w:pStyle w:val="Normal"/>
-        <w:bidi w:val="0"/>
-        <w:spacing w:before="0" w:after="0"/>
         <w:jc w:val="both"/>
         <w:rPr>
           <w:del w:id="86" w:author="Unbekannter Autor" w:date="2024-10-13T23:22:25Z"/>
@@ -5940,24 +5962,6 @@
         <w:bidi w:val="0"/>
         <w:jc w:val="both"/>
         <w:rPr>
-          <w:rFonts w:ascii="Arial" w:hAnsi="Arial"/>
-          <w:sz w:val="20"/>
-          <w:szCs w:val="20"/>
-        </w:rPr>
-      </w:pPr>
-      <w:r>
-        <w:rPr>
-          <w:sz w:val="20"/>
-          <w:szCs w:val="20"/>
-        </w:rPr>
-      </w:r>
-    </w:p>
-    <w:p>
-      <w:pPr>
-        <w:pStyle w:val="Normal"/>
-        <w:bidi w:val="0"/>
-        <w:jc w:val="both"/>
-        <w:rPr>
           <w:del w:id="89" w:author="Unbekannter Autor" w:date="2024-10-13T23:04:56Z"/>
           <w:sz w:val="20"/>
           <w:szCs w:val="20"/>
@@ -5979,7 +5983,7 @@
         <w:pStyle w:val="Normal"/>
         <w:widowControl/>
         <w:suppressAutoHyphens w:val="true"/>
-        <w:overflowPunct w:val="true"/>
+        <w:overflowPunct w:val="false"/>
         <w:bidi w:val="0"/>
         <w:spacing w:before="0" w:after="0"/>
         <w:jc w:val="both"/>
@@ -6006,7 +6010,7 @@
         <w:pStyle w:val="Normal"/>
         <w:widowControl/>
         <w:suppressAutoHyphens w:val="true"/>
-        <w:overflowPunct w:val="true"/>
+        <w:overflowPunct w:val="false"/>
         <w:bidi w:val="0"/>
         <w:spacing w:before="0" w:after="0"/>
         <w:jc w:val="both"/>
@@ -6119,7 +6123,7 @@
       <w:r>
         <w:rPr/>
         <w:drawing>
-          <wp:anchor behindDoc="0" distT="0" distB="0" distL="0" distR="0" simplePos="0" locked="0" layoutInCell="0" allowOverlap="1" relativeHeight="14">
+          <wp:anchor distT="0" distB="0" distL="0" distR="0" simplePos="0" relativeHeight="14" behindDoc="0" locked="0" layoutInCell="0" allowOverlap="1">
             <wp:simplePos x="0" y="0"/>
             <wp:positionH relativeFrom="column">
               <wp:posOffset>133350</wp:posOffset>
@@ -6224,7 +6228,7 @@
       <w:r>
         <w:rPr/>
         <w:drawing>
-          <wp:anchor behindDoc="0" distT="0" distB="0" distL="0" distR="0" simplePos="0" locked="0" layoutInCell="0" allowOverlap="1" relativeHeight="15">
+          <wp:anchor distT="0" distB="0" distL="0" distR="0" simplePos="0" relativeHeight="15" behindDoc="0" locked="0" layoutInCell="0" allowOverlap="1">
             <wp:simplePos x="0" y="0"/>
             <wp:positionH relativeFrom="column">
               <wp:posOffset>118745</wp:posOffset>
@@ -6389,7 +6393,7 @@
       <w:r>
         <w:rPr/>
         <w:drawing>
-          <wp:anchor behindDoc="0" distT="0" distB="0" distL="0" distR="0" simplePos="0" locked="0" layoutInCell="0" allowOverlap="1" relativeHeight="16">
+          <wp:anchor distT="0" distB="0" distL="0" distR="0" simplePos="0" relativeHeight="16" behindDoc="0" locked="0" layoutInCell="0" allowOverlap="1">
             <wp:simplePos x="0" y="0"/>
             <wp:positionH relativeFrom="column">
               <wp:posOffset>68580</wp:posOffset>
@@ -6811,7 +6815,7 @@
       <w:ins w:id="118" w:author="Unbekannter Autor" w:date="2024-10-13T23:03:51Z">
         <w:r>
           <w:drawing>
-            <wp:anchor behindDoc="0" distT="0" distB="0" distL="0" distR="0" simplePos="0" locked="0" layoutInCell="0" allowOverlap="1" relativeHeight="107">
+            <wp:anchor distT="0" distB="0" distL="0" distR="0" simplePos="0" relativeHeight="107" behindDoc="0" locked="0" layoutInCell="0" allowOverlap="1">
               <wp:simplePos x="0" y="0"/>
               <wp:positionH relativeFrom="column">
                 <wp:posOffset>-6985</wp:posOffset>
@@ -7876,7 +7880,7 @@
           <w:numId w:val="0"/>
         </w:numPr>
         <w:suppressAutoHyphens w:val="true"/>
-        <w:overflowPunct w:val="true"/>
+        <w:overflowPunct w:val="false"/>
         <w:ind w:hanging="0" w:left="0"/>
         <w:jc w:val="both"/>
         <w:rPr/>
@@ -8506,7 +8510,7 @@
       <w:r>
         <w:rPr/>
         <w:drawing>
-          <wp:anchor behindDoc="0" distT="0" distB="0" distL="0" distR="0" simplePos="0" locked="0" layoutInCell="0" allowOverlap="1" relativeHeight="6">
+          <wp:anchor distT="0" distB="0" distL="0" distR="0" simplePos="0" relativeHeight="6" behindDoc="0" locked="0" layoutInCell="0" allowOverlap="1">
             <wp:simplePos x="0" y="0"/>
             <wp:positionH relativeFrom="column">
               <wp:posOffset>-41275</wp:posOffset>
@@ -8707,7 +8711,7 @@
       <w:r>
         <w:rPr/>
         <w:drawing>
-          <wp:anchor behindDoc="0" distT="0" distB="0" distL="0" distR="0" simplePos="0" locked="0" layoutInCell="0" allowOverlap="1" relativeHeight="7">
+          <wp:anchor distT="0" distB="0" distL="0" distR="0" simplePos="0" relativeHeight="7" behindDoc="0" locked="0" layoutInCell="0" allowOverlap="1">
             <wp:simplePos x="0" y="0"/>
             <wp:positionH relativeFrom="column">
               <wp:posOffset>-17780</wp:posOffset>
@@ -8807,7 +8811,7 @@
       <w:r>
         <w:rPr/>
         <w:drawing>
-          <wp:anchor behindDoc="0" distT="0" distB="0" distL="0" distR="0" simplePos="0" locked="0" layoutInCell="0" allowOverlap="1" relativeHeight="8">
+          <wp:anchor distT="0" distB="0" distL="0" distR="0" simplePos="0" relativeHeight="8" behindDoc="0" locked="0" layoutInCell="0" allowOverlap="1">
             <wp:simplePos x="0" y="0"/>
             <wp:positionH relativeFrom="column">
               <wp:posOffset>-28575</wp:posOffset>
@@ -9248,7 +9252,7 @@
           <w:iCs/>
         </w:rPr>
         <w:drawing>
-          <wp:anchor behindDoc="0" distT="0" distB="0" distL="0" distR="0" simplePos="0" locked="0" layoutInCell="0" allowOverlap="1" relativeHeight="9">
+          <wp:anchor distT="0" distB="0" distL="0" distR="0" simplePos="0" relativeHeight="9" behindDoc="0" locked="0" layoutInCell="0" allowOverlap="1">
             <wp:simplePos x="0" y="0"/>
             <wp:positionH relativeFrom="column">
               <wp:posOffset>28575</wp:posOffset>
@@ -9373,7 +9377,7 @@
       <w:r>
         <w:rPr/>
         <w:drawing>
-          <wp:anchor behindDoc="0" distT="0" distB="0" distL="0" distR="0" simplePos="0" locked="0" layoutInCell="0" allowOverlap="1" relativeHeight="10">
+          <wp:anchor distT="0" distB="0" distL="0" distR="0" simplePos="0" relativeHeight="10" behindDoc="0" locked="0" layoutInCell="0" allowOverlap="1">
             <wp:simplePos x="0" y="0"/>
             <wp:positionH relativeFrom="column">
               <wp:posOffset>-14605</wp:posOffset>
@@ -9580,7 +9584,7 @@
       <w:r>
         <w:rPr/>
         <w:drawing>
-          <wp:anchor behindDoc="0" distT="0" distB="0" distL="0" distR="0" simplePos="0" locked="0" layoutInCell="0" allowOverlap="1" relativeHeight="11">
+          <wp:anchor distT="0" distB="0" distL="0" distR="0" simplePos="0" relativeHeight="11" behindDoc="0" locked="0" layoutInCell="0" allowOverlap="1">
             <wp:simplePos x="0" y="0"/>
             <wp:positionH relativeFrom="column">
               <wp:posOffset>17780</wp:posOffset>
@@ -9897,7 +9901,7 @@
       <w:r>
         <w:rPr/>
         <w:drawing>
-          <wp:anchor behindDoc="0" distT="0" distB="0" distL="0" distR="0" simplePos="0" locked="0" layoutInCell="0" allowOverlap="1" relativeHeight="12">
+          <wp:anchor distT="0" distB="0" distL="0" distR="0" simplePos="0" relativeHeight="12" behindDoc="0" locked="0" layoutInCell="0" allowOverlap="1">
             <wp:simplePos x="0" y="0"/>
             <wp:positionH relativeFrom="column">
               <wp:posOffset>6985</wp:posOffset>
@@ -10053,7 +10057,7 @@
       <w:r>
         <w:rPr/>
         <w:drawing>
-          <wp:anchor behindDoc="0" distT="0" distB="0" distL="0" distR="0" simplePos="0" locked="0" layoutInCell="0" allowOverlap="1" relativeHeight="13">
+          <wp:anchor distT="0" distB="0" distL="0" distR="0" simplePos="0" relativeHeight="13" behindDoc="0" locked="0" layoutInCell="0" allowOverlap="1">
             <wp:simplePos x="0" y="0"/>
             <wp:positionH relativeFrom="column">
               <wp:posOffset>0</wp:posOffset>
@@ -10811,7 +10815,7 @@
       <w:r>
         <w:rPr/>
         <w:drawing>
-          <wp:anchor behindDoc="0" distT="0" distB="0" distL="0" distR="0" simplePos="0" locked="0" layoutInCell="0" allowOverlap="1" relativeHeight="37">
+          <wp:anchor distT="0" distB="0" distL="0" distR="0" simplePos="0" relativeHeight="37" behindDoc="0" locked="0" layoutInCell="0" allowOverlap="1">
             <wp:simplePos x="0" y="0"/>
             <wp:positionH relativeFrom="column">
               <wp:posOffset>-35560</wp:posOffset>
@@ -10978,7 +10982,7 @@
       <w:r>
         <w:rPr/>
         <w:drawing>
-          <wp:anchor behindDoc="0" distT="0" distB="0" distL="0" distR="0" simplePos="0" locked="0" layoutInCell="0" allowOverlap="1" relativeHeight="38">
+          <wp:anchor distT="0" distB="0" distL="0" distR="0" simplePos="0" relativeHeight="38" behindDoc="0" locked="0" layoutInCell="0" allowOverlap="1">
             <wp:simplePos x="0" y="0"/>
             <wp:positionH relativeFrom="column">
               <wp:posOffset>-43180</wp:posOffset>
@@ -11070,7 +11074,7 @@
       <w:r>
         <w:rPr/>
         <w:drawing>
-          <wp:anchor behindDoc="0" distT="0" distB="0" distL="0" distR="0" simplePos="0" locked="0" layoutInCell="0" allowOverlap="1" relativeHeight="39">
+          <wp:anchor distT="0" distB="0" distL="0" distR="0" simplePos="0" relativeHeight="39" behindDoc="0" locked="0" layoutInCell="0" allowOverlap="1">
             <wp:simplePos x="0" y="0"/>
             <wp:positionH relativeFrom="column">
               <wp:posOffset>39370</wp:posOffset>
@@ -11190,7 +11194,7 @@
       <w:r>
         <w:rPr/>
         <w:drawing>
-          <wp:anchor behindDoc="0" distT="0" distB="0" distL="0" distR="0" simplePos="0" locked="0" layoutInCell="0" allowOverlap="1" relativeHeight="40">
+          <wp:anchor distT="0" distB="0" distL="0" distR="0" simplePos="0" relativeHeight="40" behindDoc="0" locked="0" layoutInCell="0" allowOverlap="1">
             <wp:simplePos x="0" y="0"/>
             <wp:positionH relativeFrom="column">
               <wp:posOffset>-5080</wp:posOffset>
@@ -11314,7 +11318,7 @@
       <w:r>
         <w:rPr/>
         <w:drawing>
-          <wp:anchor behindDoc="0" distT="0" distB="0" distL="0" distR="0" simplePos="0" locked="0" layoutInCell="0" allowOverlap="1" relativeHeight="41">
+          <wp:anchor distT="0" distB="0" distL="0" distR="0" simplePos="0" relativeHeight="41" behindDoc="0" locked="0" layoutInCell="0" allowOverlap="1">
             <wp:simplePos x="0" y="0"/>
             <wp:positionH relativeFrom="column">
               <wp:posOffset>3810</wp:posOffset>
@@ -11429,7 +11433,7 @@
       <w:r>
         <w:rPr/>
         <w:drawing>
-          <wp:anchor behindDoc="0" distT="0" distB="0" distL="0" distR="0" simplePos="0" locked="0" layoutInCell="0" allowOverlap="1" relativeHeight="42">
+          <wp:anchor distT="0" distB="0" distL="0" distR="0" simplePos="0" relativeHeight="42" behindDoc="0" locked="0" layoutInCell="0" allowOverlap="1">
             <wp:simplePos x="0" y="0"/>
             <wp:positionH relativeFrom="column">
               <wp:posOffset>36195</wp:posOffset>
@@ -11566,7 +11570,7 @@
       <w:r>
         <w:rPr/>
         <w:drawing>
-          <wp:anchor behindDoc="0" distT="0" distB="0" distL="0" distR="0" simplePos="0" locked="0" layoutInCell="0" allowOverlap="1" relativeHeight="43">
+          <wp:anchor distT="0" distB="0" distL="0" distR="0" simplePos="0" relativeHeight="43" behindDoc="0" locked="0" layoutInCell="0" allowOverlap="1">
             <wp:simplePos x="0" y="0"/>
             <wp:positionH relativeFrom="column">
               <wp:posOffset>6985</wp:posOffset>
@@ -12801,7 +12805,7 @@
           <w:numId w:val="0"/>
         </w:numPr>
         <w:suppressAutoHyphens w:val="true"/>
-        <w:overflowPunct w:val="true"/>
+        <w:overflowPunct w:val="false"/>
         <w:bidi w:val="0"/>
         <w:ind w:hanging="0" w:left="0"/>
         <w:jc w:val="left"/>
@@ -12904,7 +12908,7 @@
           <w:numId w:val="0"/>
         </w:numPr>
         <w:suppressAutoHyphens w:val="true"/>
-        <w:overflowPunct w:val="true"/>
+        <w:overflowPunct w:val="false"/>
         <w:bidi w:val="0"/>
         <w:ind w:hanging="0" w:left="0"/>
         <w:jc w:val="left"/>
@@ -12960,7 +12964,7 @@
       <w:r>
         <w:rPr/>
         <w:drawing>
-          <wp:anchor behindDoc="0" distT="0" distB="0" distL="0" distR="0" simplePos="0" locked="0" layoutInCell="0" allowOverlap="1" relativeHeight="44">
+          <wp:anchor distT="0" distB="0" distL="0" distR="0" simplePos="0" relativeHeight="44" behindDoc="0" locked="0" layoutInCell="0" allowOverlap="1">
             <wp:simplePos x="0" y="0"/>
             <wp:positionH relativeFrom="column">
               <wp:posOffset>-3810</wp:posOffset>
@@ -13099,7 +13103,7 @@
       <w:r>
         <w:rPr/>
         <w:drawing>
-          <wp:anchor behindDoc="0" distT="0" distB="0" distL="0" distR="0" simplePos="0" locked="0" layoutInCell="0" allowOverlap="1" relativeHeight="45">
+          <wp:anchor distT="0" distB="0" distL="0" distR="0" simplePos="0" relativeHeight="45" behindDoc="0" locked="0" layoutInCell="0" allowOverlap="1">
             <wp:simplePos x="0" y="0"/>
             <wp:positionH relativeFrom="column">
               <wp:posOffset>17780</wp:posOffset>
@@ -15228,7 +15232,7 @@
           <w:numId w:val="0"/>
         </w:numPr>
         <w:suppressAutoHyphens w:val="true"/>
-        <w:overflowPunct w:val="true"/>
+        <w:overflowPunct w:val="false"/>
         <w:ind w:hanging="0" w:left="0"/>
         <w:jc w:val="left"/>
         <w:rPr>
@@ -15272,7 +15276,7 @@
           <w:numId w:val="0"/>
         </w:numPr>
         <w:suppressAutoHyphens w:val="true"/>
-        <w:overflowPunct w:val="true"/>
+        <w:overflowPunct w:val="false"/>
         <w:ind w:hanging="0" w:left="0"/>
         <w:jc w:val="left"/>
         <w:rPr>
@@ -15614,7 +15618,7 @@
           <w:numId w:val="3"/>
         </w:numPr>
         <w:suppressAutoHyphens w:val="true"/>
-        <w:overflowPunct w:val="true"/>
+        <w:overflowPunct w:val="false"/>
         <w:ind w:hanging="0" w:left="0"/>
         <w:jc w:val="left"/>
         <w:rPr>
@@ -15636,7 +15640,7 @@
           <w:numId w:val="3"/>
         </w:numPr>
         <w:suppressAutoHyphens w:val="true"/>
-        <w:overflowPunct w:val="true"/>
+        <w:overflowPunct w:val="false"/>
         <w:ind w:hanging="0" w:left="0"/>
         <w:jc w:val="both"/>
         <w:rPr/>
@@ -15657,7 +15661,7 @@
           <w:numId w:val="0"/>
         </w:numPr>
         <w:suppressAutoHyphens w:val="true"/>
-        <w:overflowPunct w:val="true"/>
+        <w:overflowPunct w:val="false"/>
         <w:ind w:hanging="0" w:left="0"/>
         <w:jc w:val="both"/>
         <w:rPr/>
@@ -15675,7 +15679,7 @@
           <w:numId w:val="0"/>
         </w:numPr>
         <w:suppressAutoHyphens w:val="true"/>
-        <w:overflowPunct w:val="true"/>
+        <w:overflowPunct w:val="false"/>
         <w:ind w:hanging="0" w:left="0"/>
         <w:jc w:val="both"/>
         <w:rPr/>
@@ -15728,7 +15732,7 @@
           <w:numId w:val="0"/>
         </w:numPr>
         <w:suppressAutoHyphens w:val="true"/>
-        <w:overflowPunct w:val="true"/>
+        <w:overflowPunct w:val="false"/>
         <w:ind w:hanging="0" w:left="0"/>
         <w:jc w:val="both"/>
         <w:rPr/>
@@ -15782,7 +15786,7 @@
           <w:numId w:val="22"/>
         </w:numPr>
         <w:suppressAutoHyphens w:val="true"/>
-        <w:overflowPunct w:val="true"/>
+        <w:overflowPunct w:val="false"/>
         <w:jc w:val="both"/>
         <w:rPr/>
       </w:pPr>
@@ -15819,7 +15823,7 @@
           <w:numId w:val="22"/>
         </w:numPr>
         <w:suppressAutoHyphens w:val="true"/>
-        <w:overflowPunct w:val="true"/>
+        <w:overflowPunct w:val="false"/>
         <w:jc w:val="both"/>
         <w:rPr/>
       </w:pPr>
@@ -15856,7 +15860,7 @@
           <w:numId w:val="0"/>
         </w:numPr>
         <w:suppressAutoHyphens w:val="true"/>
-        <w:overflowPunct w:val="true"/>
+        <w:overflowPunct w:val="false"/>
         <w:ind w:hanging="0" w:left="0"/>
         <w:jc w:val="both"/>
         <w:rPr/>
@@ -15894,7 +15898,7 @@
           <w:numId w:val="0"/>
         </w:numPr>
         <w:suppressAutoHyphens w:val="true"/>
-        <w:overflowPunct w:val="true"/>
+        <w:overflowPunct w:val="false"/>
         <w:ind w:hanging="0" w:left="0"/>
         <w:jc w:val="both"/>
         <w:rPr>
@@ -15914,7 +15918,7 @@
           <w:numId w:val="0"/>
         </w:numPr>
         <w:suppressAutoHyphens w:val="true"/>
-        <w:overflowPunct w:val="true"/>
+        <w:overflowPunct w:val="false"/>
         <w:ind w:hanging="0" w:left="0"/>
         <w:jc w:val="both"/>
         <w:rPr/>
@@ -15936,7 +15940,7 @@
           <w:numId w:val="0"/>
         </w:numPr>
         <w:suppressAutoHyphens w:val="true"/>
-        <w:overflowPunct w:val="true"/>
+        <w:overflowPunct w:val="false"/>
         <w:ind w:hanging="0" w:left="0"/>
         <w:jc w:val="both"/>
         <w:rPr/>
@@ -15992,7 +15996,7 @@
           <w:numId w:val="0"/>
         </w:numPr>
         <w:suppressAutoHyphens w:val="true"/>
-        <w:overflowPunct w:val="true"/>
+        <w:overflowPunct w:val="false"/>
         <w:spacing w:before="140" w:after="120"/>
         <w:ind w:hanging="0" w:left="0"/>
         <w:jc w:val="both"/>
@@ -16032,7 +16036,7 @@
           <w:numId w:val="0"/>
         </w:numPr>
         <w:suppressAutoHyphens w:val="true"/>
-        <w:overflowPunct w:val="true"/>
+        <w:overflowPunct w:val="false"/>
         <w:ind w:hanging="0" w:left="0"/>
         <w:jc w:val="both"/>
         <w:rPr/>
@@ -16086,7 +16090,7 @@
           <w:numId w:val="23"/>
         </w:numPr>
         <w:suppressAutoHyphens w:val="true"/>
-        <w:overflowPunct w:val="true"/>
+        <w:overflowPunct w:val="false"/>
         <w:jc w:val="both"/>
         <w:rPr/>
       </w:pPr>
@@ -16123,7 +16127,7 @@
           <w:numId w:val="23"/>
         </w:numPr>
         <w:suppressAutoHyphens w:val="true"/>
-        <w:overflowPunct w:val="true"/>
+        <w:overflowPunct w:val="false"/>
         <w:jc w:val="both"/>
         <w:rPr/>
       </w:pPr>
@@ -16160,7 +16164,7 @@
           <w:numId w:val="23"/>
         </w:numPr>
         <w:suppressAutoHyphens w:val="true"/>
-        <w:overflowPunct w:val="true"/>
+        <w:overflowPunct w:val="false"/>
         <w:jc w:val="both"/>
         <w:rPr/>
       </w:pPr>
@@ -16199,7 +16203,7 @@
           <w:numId w:val="0"/>
         </w:numPr>
         <w:suppressAutoHyphens w:val="true"/>
-        <w:overflowPunct w:val="true"/>
+        <w:overflowPunct w:val="false"/>
         <w:ind w:hanging="0" w:left="0"/>
         <w:jc w:val="both"/>
         <w:rPr>
@@ -16219,7 +16223,7 @@
           <w:numId w:val="0"/>
         </w:numPr>
         <w:suppressAutoHyphens w:val="true"/>
-        <w:overflowPunct w:val="true"/>
+        <w:overflowPunct w:val="false"/>
         <w:ind w:hanging="0" w:left="0"/>
         <w:jc w:val="both"/>
         <w:rPr/>
@@ -16241,7 +16245,7 @@
           <w:numId w:val="0"/>
         </w:numPr>
         <w:suppressAutoHyphens w:val="true"/>
-        <w:overflowPunct w:val="true"/>
+        <w:overflowPunct w:val="false"/>
         <w:ind w:hanging="0" w:left="0"/>
         <w:jc w:val="both"/>
         <w:rPr/>
@@ -16283,7 +16287,7 @@
           <w:numId w:val="0"/>
         </w:numPr>
         <w:suppressAutoHyphens w:val="true"/>
-        <w:overflowPunct w:val="true"/>
+        <w:overflowPunct w:val="false"/>
         <w:ind w:hanging="0" w:left="0"/>
         <w:jc w:val="left"/>
         <w:rPr>
@@ -16308,7 +16312,7 @@
           <w:numId w:val="0"/>
         </w:numPr>
         <w:suppressAutoHyphens w:val="true"/>
-        <w:overflowPunct w:val="true"/>
+        <w:overflowPunct w:val="false"/>
         <w:ind w:hanging="0" w:left="0"/>
         <w:jc w:val="center"/>
         <w:rPr>
@@ -16375,7 +16379,7 @@
           <w:numId w:val="0"/>
         </w:numPr>
         <w:suppressAutoHyphens w:val="true"/>
-        <w:overflowPunct w:val="true"/>
+        <w:overflowPunct w:val="false"/>
         <w:bidi w:val="0"/>
         <w:ind w:hanging="0" w:left="0"/>
         <w:jc w:val="left"/>
@@ -17802,7 +17806,7 @@
       <w:r>
         <w:rPr/>
         <w:drawing>
-          <wp:anchor behindDoc="0" distT="0" distB="0" distL="0" distR="0" simplePos="0" locked="0" layoutInCell="0" allowOverlap="1" relativeHeight="46">
+          <wp:anchor distT="0" distB="0" distL="0" distR="0" simplePos="0" relativeHeight="46" behindDoc="0" locked="0" layoutInCell="0" allowOverlap="1">
             <wp:simplePos x="0" y="0"/>
             <wp:positionH relativeFrom="column">
               <wp:posOffset>0</wp:posOffset>
@@ -17957,7 +17961,7 @@
       <w:r>
         <w:rPr/>
         <w:drawing>
-          <wp:anchor behindDoc="0" distT="0" distB="0" distL="0" distR="0" simplePos="0" locked="0" layoutInCell="0" allowOverlap="1" relativeHeight="47">
+          <wp:anchor distT="0" distB="0" distL="0" distR="0" simplePos="0" relativeHeight="47" behindDoc="0" locked="0" layoutInCell="0" allowOverlap="1">
             <wp:simplePos x="0" y="0"/>
             <wp:positionH relativeFrom="column">
               <wp:posOffset>36195</wp:posOffset>
@@ -18096,7 +18100,7 @@
       <w:r>
         <w:rPr/>
         <w:drawing>
-          <wp:anchor behindDoc="0" distT="0" distB="0" distL="0" distR="0" simplePos="0" locked="0" layoutInCell="0" allowOverlap="1" relativeHeight="96">
+          <wp:anchor distT="0" distB="0" distL="0" distR="0" simplePos="0" relativeHeight="96" behindDoc="0" locked="0" layoutInCell="0" allowOverlap="1">
             <wp:simplePos x="0" y="0"/>
             <wp:positionH relativeFrom="column">
               <wp:posOffset>21590</wp:posOffset>
@@ -18291,7 +18295,7 @@
       <w:r>
         <w:rPr/>
         <w:drawing>
-          <wp:anchor behindDoc="0" distT="0" distB="0" distL="0" distR="0" simplePos="0" locked="0" layoutInCell="0" allowOverlap="1" relativeHeight="98">
+          <wp:anchor distT="0" distB="0" distL="0" distR="0" simplePos="0" relativeHeight="98" behindDoc="0" locked="0" layoutInCell="0" allowOverlap="1">
             <wp:simplePos x="0" y="0"/>
             <wp:positionH relativeFrom="column">
               <wp:posOffset>57785</wp:posOffset>
@@ -18580,7 +18584,7 @@
       <w:r>
         <w:rPr/>
         <w:drawing>
-          <wp:anchor behindDoc="0" distT="0" distB="0" distL="0" distR="0" simplePos="0" locked="0" layoutInCell="0" allowOverlap="1" relativeHeight="48">
+          <wp:anchor distT="0" distB="0" distL="0" distR="0" simplePos="0" relativeHeight="48" behindDoc="0" locked="0" layoutInCell="0" allowOverlap="1">
             <wp:simplePos x="0" y="0"/>
             <wp:positionH relativeFrom="column">
               <wp:posOffset>3810</wp:posOffset>
@@ -18701,7 +18705,7 @@
       <w:r>
         <w:rPr/>
         <w:drawing>
-          <wp:anchor behindDoc="0" distT="0" distB="0" distL="0" distR="0" simplePos="0" locked="0" layoutInCell="0" allowOverlap="1" relativeHeight="49">
+          <wp:anchor distT="0" distB="0" distL="0" distR="0" simplePos="0" relativeHeight="49" behindDoc="0" locked="0" layoutInCell="0" allowOverlap="1">
             <wp:simplePos x="0" y="0"/>
             <wp:positionH relativeFrom="column">
               <wp:posOffset>14605</wp:posOffset>
@@ -18809,7 +18813,7 @@
       <w:r>
         <w:rPr/>
         <w:drawing>
-          <wp:anchor behindDoc="0" distT="0" distB="0" distL="0" distR="0" simplePos="0" locked="0" layoutInCell="0" allowOverlap="1" relativeHeight="50">
+          <wp:anchor distT="0" distB="0" distL="0" distR="0" simplePos="0" relativeHeight="50" behindDoc="0" locked="0" layoutInCell="0" allowOverlap="1">
             <wp:simplePos x="0" y="0"/>
             <wp:positionH relativeFrom="column">
               <wp:posOffset>36195</wp:posOffset>
@@ -18912,7 +18916,7 @@
       <w:r>
         <w:rPr/>
         <w:drawing>
-          <wp:anchor behindDoc="0" distT="0" distB="0" distL="0" distR="0" simplePos="0" locked="0" layoutInCell="0" allowOverlap="1" relativeHeight="51">
+          <wp:anchor distT="0" distB="0" distL="0" distR="0" simplePos="0" relativeHeight="51" behindDoc="0" locked="0" layoutInCell="0" allowOverlap="1">
             <wp:simplePos x="0" y="0"/>
             <wp:positionH relativeFrom="column">
               <wp:posOffset>-32385</wp:posOffset>
@@ -19334,7 +19338,7 @@
           <w:szCs w:val="20"/>
         </w:rPr>
         <w:drawing>
-          <wp:anchor behindDoc="0" distT="0" distB="0" distL="0" distR="0" simplePos="0" locked="0" layoutInCell="0" allowOverlap="1" relativeHeight="102">
+          <wp:anchor distT="0" distB="0" distL="0" distR="0" simplePos="0" relativeHeight="102" behindDoc="0" locked="0" layoutInCell="0" allowOverlap="1">
             <wp:simplePos x="0" y="0"/>
             <wp:positionH relativeFrom="column">
               <wp:posOffset>6985</wp:posOffset>
@@ -19532,7 +19536,7 @@
       <w:del w:id="137" w:author="Unbekannter Autor" w:date="2024-09-16T14:58:41Z">
         <w:r>
           <w:drawing>
-            <wp:anchor behindDoc="0" distT="0" distB="0" distL="0" distR="0" simplePos="0" locked="0" layoutInCell="0" allowOverlap="1" relativeHeight="108">
+            <wp:anchor distT="0" distB="0" distL="0" distR="0" simplePos="0" relativeHeight="108" behindDoc="0" locked="0" layoutInCell="0" allowOverlap="1">
               <wp:simplePos x="0" y="0"/>
               <wp:positionH relativeFrom="column">
                 <wp:posOffset>-3810</wp:posOffset>
@@ -19630,7 +19634,7 @@
       <w:del w:id="142" w:author="Unbekannter Autor" w:date="2024-09-16T14:58:41Z">
         <w:r>
           <w:drawing>
-            <wp:anchor behindDoc="0" distT="0" distB="0" distL="0" distR="0" simplePos="0" locked="0" layoutInCell="0" allowOverlap="1" relativeHeight="110">
+            <wp:anchor distT="0" distB="0" distL="0" distR="0" simplePos="0" relativeHeight="110" behindDoc="0" locked="0" layoutInCell="0" allowOverlap="1">
               <wp:simplePos x="0" y="0"/>
               <wp:positionH relativeFrom="column">
                 <wp:posOffset>161925</wp:posOffset>
@@ -19745,7 +19749,7 @@
           <w:numId w:val="0"/>
         </w:numPr>
         <w:suppressAutoHyphens w:val="true"/>
-        <w:overflowPunct w:val="true"/>
+        <w:overflowPunct w:val="false"/>
         <w:ind w:hanging="0" w:left="0"/>
         <w:jc w:val="left"/>
         <w:rPr>
@@ -19755,7 +19759,7 @@
       <w:r>
         <w:rPr/>
         <w:drawing>
-          <wp:anchor behindDoc="0" distT="0" distB="0" distL="0" distR="0" simplePos="0" locked="0" layoutInCell="0" allowOverlap="1" relativeHeight="109">
+          <wp:anchor distT="0" distB="0" distL="0" distR="0" simplePos="0" relativeHeight="109" behindDoc="0" locked="0" layoutInCell="0" allowOverlap="1">
             <wp:simplePos x="0" y="0"/>
             <wp:positionH relativeFrom="column">
               <wp:posOffset>6985</wp:posOffset>
@@ -19840,7 +19844,7 @@
       <w:r>
         <w:rPr/>
         <w:drawing>
-          <wp:anchor behindDoc="0" distT="0" distB="0" distL="0" distR="0" simplePos="0" locked="0" layoutInCell="0" allowOverlap="1" relativeHeight="93">
+          <wp:anchor distT="0" distB="0" distL="0" distR="0" simplePos="0" relativeHeight="93" behindDoc="0" locked="0" layoutInCell="0" allowOverlap="1">
             <wp:simplePos x="0" y="0"/>
             <wp:positionH relativeFrom="column">
               <wp:posOffset>-32385</wp:posOffset>
@@ -19994,7 +19998,7 @@
       <w:r>
         <w:rPr/>
         <w:drawing>
-          <wp:anchor behindDoc="0" distT="0" distB="0" distL="0" distR="0" simplePos="0" locked="0" layoutInCell="0" allowOverlap="1" relativeHeight="94">
+          <wp:anchor distT="0" distB="0" distL="0" distR="0" simplePos="0" relativeHeight="94" behindDoc="0" locked="0" layoutInCell="0" allowOverlap="1">
             <wp:simplePos x="0" y="0"/>
             <wp:positionH relativeFrom="column">
               <wp:posOffset>17780</wp:posOffset>
@@ -20788,7 +20792,7 @@
       <w:r>
         <w:rPr/>
         <w:drawing>
-          <wp:anchor behindDoc="0" distT="0" distB="0" distL="0" distR="0" simplePos="0" locked="0" layoutInCell="0" allowOverlap="1" relativeHeight="52">
+          <wp:anchor distT="0" distB="0" distL="0" distR="0" simplePos="0" relativeHeight="52" behindDoc="0" locked="0" layoutInCell="0" allowOverlap="1">
             <wp:simplePos x="0" y="0"/>
             <wp:positionH relativeFrom="column">
               <wp:posOffset>17145</wp:posOffset>
@@ -20927,7 +20931,7 @@
       <w:r>
         <w:rPr/>
         <w:drawing>
-          <wp:anchor behindDoc="0" distT="0" distB="0" distL="0" distR="0" simplePos="0" locked="0" layoutInCell="0" allowOverlap="1" relativeHeight="53">
+          <wp:anchor distT="0" distB="0" distL="0" distR="0" simplePos="0" relativeHeight="53" behindDoc="0" locked="0" layoutInCell="0" allowOverlap="1">
             <wp:simplePos x="0" y="0"/>
             <wp:positionH relativeFrom="column">
               <wp:posOffset>-17780</wp:posOffset>
@@ -21046,7 +21050,7 @@
       <w:r>
         <w:rPr/>
         <w:drawing>
-          <wp:anchor behindDoc="0" distT="0" distB="0" distL="0" distR="0" simplePos="0" locked="0" layoutInCell="0" allowOverlap="1" relativeHeight="54">
+          <wp:anchor distT="0" distB="0" distL="0" distR="0" simplePos="0" relativeHeight="54" behindDoc="0" locked="0" layoutInCell="0" allowOverlap="1">
             <wp:simplePos x="0" y="0"/>
             <wp:positionH relativeFrom="column">
               <wp:posOffset>10795</wp:posOffset>
@@ -21249,7 +21253,7 @@
           <w:rFonts w:ascii="Arial" w:hAnsi="Arial"/>
         </w:rPr>
         <w:drawing>
-          <wp:anchor behindDoc="0" distT="0" distB="0" distL="0" distR="0" simplePos="0" locked="0" layoutInCell="0" allowOverlap="1" relativeHeight="55">
+          <wp:anchor distT="0" distB="0" distL="0" distR="0" simplePos="0" relativeHeight="55" behindDoc="0" locked="0" layoutInCell="0" allowOverlap="1">
             <wp:simplePos x="0" y="0"/>
             <wp:positionH relativeFrom="column">
               <wp:posOffset>68580</wp:posOffset>
@@ -21382,7 +21386,7 @@
           <w:numId w:val="0"/>
         </w:numPr>
         <w:suppressAutoHyphens w:val="true"/>
-        <w:overflowPunct w:val="true"/>
+        <w:overflowPunct w:val="false"/>
         <w:ind w:hanging="0" w:left="0"/>
         <w:jc w:val="left"/>
         <w:rPr>
@@ -21543,7 +21547,7 @@
       <w:r>
         <w:rPr/>
         <w:drawing>
-          <wp:anchor behindDoc="0" distT="0" distB="0" distL="0" distR="0" simplePos="0" locked="0" layoutInCell="0" allowOverlap="1" relativeHeight="56">
+          <wp:anchor distT="0" distB="0" distL="0" distR="0" simplePos="0" relativeHeight="56" behindDoc="0" locked="0" layoutInCell="0" allowOverlap="1">
             <wp:simplePos x="0" y="0"/>
             <wp:positionH relativeFrom="column">
               <wp:posOffset>46990</wp:posOffset>
@@ -21675,7 +21679,7 @@
       <w:r>
         <w:rPr/>
         <w:drawing>
-          <wp:anchor behindDoc="0" distT="0" distB="0" distL="0" distR="0" simplePos="0" locked="0" layoutInCell="0" allowOverlap="1" relativeHeight="57">
+          <wp:anchor distT="0" distB="0" distL="0" distR="0" simplePos="0" relativeHeight="57" behindDoc="0" locked="0" layoutInCell="0" allowOverlap="1">
             <wp:simplePos x="0" y="0"/>
             <wp:positionH relativeFrom="column">
               <wp:posOffset>17780</wp:posOffset>
@@ -21836,7 +21840,7 @@
       <w:r>
         <w:rPr/>
         <w:drawing>
-          <wp:anchor behindDoc="0" distT="0" distB="0" distL="0" distR="0" simplePos="0" locked="0" layoutInCell="0" allowOverlap="1" relativeHeight="58">
+          <wp:anchor distT="0" distB="0" distL="0" distR="0" simplePos="0" relativeHeight="58" behindDoc="0" locked="0" layoutInCell="0" allowOverlap="1">
             <wp:simplePos x="0" y="0"/>
             <wp:positionH relativeFrom="column">
               <wp:posOffset>6985</wp:posOffset>
@@ -22003,7 +22007,7 @@
           <w:numId w:val="0"/>
         </w:numPr>
         <w:suppressAutoHyphens w:val="true"/>
-        <w:overflowPunct w:val="true"/>
+        <w:overflowPunct w:val="false"/>
         <w:ind w:hanging="0" w:left="0"/>
         <w:jc w:val="left"/>
         <w:rPr>
@@ -22071,7 +22075,7 @@
       <w:r>
         <w:rPr/>
         <w:drawing>
-          <wp:anchor behindDoc="0" distT="0" distB="0" distL="0" distR="0" simplePos="0" locked="0" layoutInCell="0" allowOverlap="1" relativeHeight="59">
+          <wp:anchor distT="0" distB="0" distL="0" distR="0" simplePos="0" relativeHeight="59" behindDoc="0" locked="0" layoutInCell="0" allowOverlap="1">
             <wp:simplePos x="0" y="0"/>
             <wp:positionH relativeFrom="column">
               <wp:posOffset>21590</wp:posOffset>
@@ -22173,7 +22177,7 @@
       <w:r>
         <w:rPr/>
         <w:drawing>
-          <wp:anchor behindDoc="0" distT="0" distB="0" distL="0" distR="0" simplePos="0" locked="0" layoutInCell="0" allowOverlap="1" relativeHeight="60">
+          <wp:anchor distT="0" distB="0" distL="0" distR="0" simplePos="0" relativeHeight="60" behindDoc="0" locked="0" layoutInCell="0" allowOverlap="1">
             <wp:simplePos x="0" y="0"/>
             <wp:positionH relativeFrom="column">
               <wp:posOffset>6985</wp:posOffset>
@@ -22436,7 +22440,7 @@
           <w:numId w:val="3"/>
         </w:numPr>
         <w:suppressAutoHyphens w:val="true"/>
-        <w:overflowPunct w:val="true"/>
+        <w:overflowPunct w:val="false"/>
         <w:bidi w:val="0"/>
         <w:jc w:val="center"/>
         <w:rPr>
@@ -22649,7 +22653,7 @@
           <w:szCs w:val="20"/>
         </w:rPr>
         <w:drawing>
-          <wp:anchor behindDoc="0" distT="0" distB="0" distL="0" distR="0" simplePos="0" locked="0" layoutInCell="0" allowOverlap="1" relativeHeight="61">
+          <wp:anchor distT="0" distB="0" distL="0" distR="0" simplePos="0" relativeHeight="61" behindDoc="0" locked="0" layoutInCell="0" allowOverlap="1">
             <wp:simplePos x="0" y="0"/>
             <wp:positionH relativeFrom="column">
               <wp:posOffset>3202940</wp:posOffset>
@@ -22712,7 +22716,7 @@
       <w:r>
         <w:rPr/>
         <w:drawing>
-          <wp:anchor behindDoc="0" distT="0" distB="0" distL="0" distR="0" simplePos="0" locked="0" layoutInCell="0" allowOverlap="1" relativeHeight="62">
+          <wp:anchor distT="0" distB="0" distL="0" distR="0" simplePos="0" relativeHeight="62" behindDoc="0" locked="0" layoutInCell="0" allowOverlap="1">
             <wp:simplePos x="0" y="0"/>
             <wp:positionH relativeFrom="column">
               <wp:posOffset>0</wp:posOffset>
@@ -23373,7 +23377,7 @@
       <w:r>
         <w:rPr/>
         <w:drawing>
-          <wp:anchor behindDoc="0" distT="0" distB="0" distL="0" distR="0" simplePos="0" locked="0" layoutInCell="0" allowOverlap="1" relativeHeight="99">
+          <wp:anchor distT="0" distB="0" distL="0" distR="0" simplePos="0" relativeHeight="99" behindDoc="0" locked="0" layoutInCell="0" allowOverlap="1">
             <wp:simplePos x="0" y="0"/>
             <wp:positionH relativeFrom="column">
               <wp:posOffset>3232785</wp:posOffset>
@@ -23432,7 +23436,7 @@
       <w:r>
         <w:rPr/>
         <w:drawing>
-          <wp:anchor behindDoc="0" distT="0" distB="0" distL="0" distR="0" simplePos="0" locked="0" layoutInCell="0" allowOverlap="1" relativeHeight="63">
+          <wp:anchor distT="0" distB="0" distL="0" distR="0" simplePos="0" relativeHeight="63" behindDoc="0" locked="0" layoutInCell="0" allowOverlap="1">
             <wp:simplePos x="0" y="0"/>
             <wp:positionH relativeFrom="column">
               <wp:posOffset>-43180</wp:posOffset>
@@ -24028,7 +24032,7 @@
       <w:r>
         <w:rPr/>
         <w:drawing>
-          <wp:anchor behindDoc="0" distT="0" distB="0" distL="0" distR="0" simplePos="0" locked="0" layoutInCell="0" allowOverlap="1" relativeHeight="64">
+          <wp:anchor distT="0" distB="0" distL="0" distR="0" simplePos="0" relativeHeight="64" behindDoc="0" locked="0" layoutInCell="0" allowOverlap="1">
             <wp:simplePos x="0" y="0"/>
             <wp:positionH relativeFrom="column">
               <wp:posOffset>36195</wp:posOffset>
@@ -24152,7 +24156,7 @@
       <w:r>
         <w:rPr/>
         <w:drawing>
-          <wp:anchor behindDoc="0" distT="0" distB="0" distL="0" distR="0" simplePos="0" locked="0" layoutInCell="0" allowOverlap="1" relativeHeight="65">
+          <wp:anchor distT="0" distB="0" distL="0" distR="0" simplePos="0" relativeHeight="65" behindDoc="0" locked="0" layoutInCell="0" allowOverlap="1">
             <wp:simplePos x="0" y="0"/>
             <wp:positionH relativeFrom="column">
               <wp:posOffset>25400</wp:posOffset>
@@ -24810,7 +24814,7 @@
           <w:numId w:val="0"/>
         </w:numPr>
         <w:suppressAutoHyphens w:val="true"/>
-        <w:overflowPunct w:val="true"/>
+        <w:overflowPunct w:val="false"/>
         <w:bidi w:val="0"/>
         <w:ind w:hanging="0" w:left="0"/>
         <w:jc w:val="both"/>
@@ -24908,7 +24912,7 @@
       <w:r>
         <w:rPr/>
         <w:drawing>
-          <wp:anchor behindDoc="0" distT="0" distB="0" distL="0" distR="0" simplePos="0" locked="0" layoutInCell="0" allowOverlap="1" relativeHeight="66">
+          <wp:anchor distT="0" distB="0" distL="0" distR="0" simplePos="0" relativeHeight="66" behindDoc="0" locked="0" layoutInCell="0" allowOverlap="1">
             <wp:simplePos x="0" y="0"/>
             <wp:positionH relativeFrom="column">
               <wp:posOffset>36195</wp:posOffset>
@@ -24954,7 +24958,7 @@
           </wp:anchor>
         </w:drawing>
         <w:drawing>
-          <wp:anchor behindDoc="0" distT="0" distB="0" distL="0" distR="0" simplePos="0" locked="0" layoutInCell="0" allowOverlap="1" relativeHeight="67">
+          <wp:anchor distT="0" distB="0" distL="0" distR="0" simplePos="0" relativeHeight="67" behindDoc="0" locked="0" layoutInCell="0" allowOverlap="1">
             <wp:simplePos x="0" y="0"/>
             <wp:positionH relativeFrom="column">
               <wp:posOffset>3282950</wp:posOffset>
@@ -25577,7 +25581,7 @@
       </w:pPr>
       <w:r>
         <w:drawing>
-          <wp:anchor behindDoc="0" distT="0" distB="0" distL="0" distR="0" simplePos="0" locked="0" layoutInCell="0" allowOverlap="1" relativeHeight="69">
+          <wp:anchor distT="0" distB="0" distL="0" distR="0" simplePos="0" relativeHeight="69" behindDoc="0" locked="0" layoutInCell="0" allowOverlap="1">
             <wp:simplePos x="0" y="0"/>
             <wp:positionH relativeFrom="column">
               <wp:posOffset>3325495</wp:posOffset>
@@ -25664,7 +25668,7 @@
       <w:r>
         <w:rPr/>
         <w:drawing>
-          <wp:anchor behindDoc="0" distT="0" distB="0" distL="0" distR="0" simplePos="0" locked="0" layoutInCell="0" allowOverlap="1" relativeHeight="68">
+          <wp:anchor distT="0" distB="0" distL="0" distR="0" simplePos="0" relativeHeight="68" behindDoc="0" locked="0" layoutInCell="0" allowOverlap="1">
             <wp:simplePos x="0" y="0"/>
             <wp:positionH relativeFrom="column">
               <wp:posOffset>3810</wp:posOffset>
@@ -26169,7 +26173,7 @@
       <w:r>
         <w:rPr/>
         <w:drawing>
-          <wp:anchor behindDoc="0" distT="0" distB="0" distL="0" distR="0" simplePos="0" locked="0" layoutInCell="0" allowOverlap="1" relativeHeight="71">
+          <wp:anchor distT="0" distB="0" distL="0" distR="0" simplePos="0" relativeHeight="71" behindDoc="0" locked="0" layoutInCell="0" allowOverlap="1">
             <wp:simplePos x="0" y="0"/>
             <wp:positionH relativeFrom="column">
               <wp:posOffset>21590</wp:posOffset>
@@ -26331,7 +26335,7 @@
       <w:r>
         <w:rPr/>
         <w:drawing>
-          <wp:anchor behindDoc="0" distT="0" distB="0" distL="0" distR="0" simplePos="0" locked="0" layoutInCell="0" allowOverlap="1" relativeHeight="72">
+          <wp:anchor distT="0" distB="0" distL="0" distR="0" simplePos="0" relativeHeight="72" behindDoc="0" locked="0" layoutInCell="0" allowOverlap="1">
             <wp:simplePos x="0" y="0"/>
             <wp:positionH relativeFrom="column">
               <wp:posOffset>46990</wp:posOffset>
@@ -26439,7 +26443,7 @@
           <w:numId w:val="0"/>
         </w:numPr>
         <w:suppressAutoHyphens w:val="true"/>
-        <w:overflowPunct w:val="true"/>
+        <w:overflowPunct w:val="false"/>
         <w:ind w:hanging="0" w:left="0"/>
         <w:jc w:val="left"/>
         <w:rPr>
@@ -26497,7 +26501,7 @@
       <w:r>
         <w:rPr/>
         <w:drawing>
-          <wp:anchor behindDoc="0" distT="0" distB="0" distL="0" distR="0" simplePos="0" locked="0" layoutInCell="0" allowOverlap="1" relativeHeight="73">
+          <wp:anchor distT="0" distB="0" distL="0" distR="0" simplePos="0" relativeHeight="73" behindDoc="0" locked="0" layoutInCell="0" allowOverlap="1">
             <wp:simplePos x="0" y="0"/>
             <wp:positionH relativeFrom="column">
               <wp:posOffset>6985</wp:posOffset>
@@ -26628,7 +26632,7 @@
       <w:r>
         <w:rPr/>
         <w:drawing>
-          <wp:anchor behindDoc="0" distT="0" distB="0" distL="0" distR="0" simplePos="0" locked="0" layoutInCell="0" allowOverlap="1" relativeHeight="74">
+          <wp:anchor distT="0" distB="0" distL="0" distR="0" simplePos="0" relativeHeight="74" behindDoc="0" locked="0" layoutInCell="0" allowOverlap="1">
             <wp:simplePos x="0" y="0"/>
             <wp:positionH relativeFrom="column">
               <wp:posOffset>50165</wp:posOffset>
@@ -26731,7 +26735,7 @@
       <w:r>
         <w:rPr/>
         <w:drawing>
-          <wp:anchor behindDoc="0" distT="0" distB="0" distL="0" distR="0" simplePos="0" locked="0" layoutInCell="0" allowOverlap="1" relativeHeight="75">
+          <wp:anchor distT="0" distB="0" distL="0" distR="0" simplePos="0" relativeHeight="75" behindDoc="0" locked="0" layoutInCell="0" allowOverlap="1">
             <wp:simplePos x="0" y="0"/>
             <wp:positionH relativeFrom="column">
               <wp:posOffset>57785</wp:posOffset>
@@ -26863,7 +26867,7 @@
           <w:szCs w:val="20"/>
         </w:rPr>
         <w:drawing>
-          <wp:anchor behindDoc="0" distT="0" distB="0" distL="0" distR="0" simplePos="0" locked="0" layoutInCell="0" allowOverlap="1" relativeHeight="76">
+          <wp:anchor distT="0" distB="0" distL="0" distR="0" simplePos="0" relativeHeight="76" behindDoc="0" locked="0" layoutInCell="0" allowOverlap="1">
             <wp:simplePos x="0" y="0"/>
             <wp:positionH relativeFrom="column">
               <wp:posOffset>75565</wp:posOffset>
@@ -27008,7 +27012,7 @@
       <w:r>
         <w:rPr/>
         <w:drawing>
-          <wp:anchor behindDoc="0" distT="0" distB="0" distL="0" distR="0" simplePos="0" locked="0" layoutInCell="0" allowOverlap="1" relativeHeight="77">
+          <wp:anchor distT="0" distB="0" distL="0" distR="0" simplePos="0" relativeHeight="77" behindDoc="0" locked="0" layoutInCell="0" allowOverlap="1">
             <wp:simplePos x="0" y="0"/>
             <wp:positionH relativeFrom="column">
               <wp:posOffset>158115</wp:posOffset>
@@ -27139,7 +27143,7 @@
           <w:szCs w:val="20"/>
         </w:rPr>
         <w:drawing>
-          <wp:anchor behindDoc="0" distT="0" distB="0" distL="0" distR="0" simplePos="0" locked="0" layoutInCell="0" allowOverlap="1" relativeHeight="78">
+          <wp:anchor distT="0" distB="0" distL="0" distR="0" simplePos="0" relativeHeight="78" behindDoc="0" locked="0" layoutInCell="0" allowOverlap="1">
             <wp:simplePos x="0" y="0"/>
             <wp:positionH relativeFrom="column">
               <wp:posOffset>28575</wp:posOffset>
@@ -27233,7 +27237,7 @@
       <w:r>
         <w:rPr/>
         <w:drawing>
-          <wp:anchor behindDoc="0" distT="0" distB="0" distL="0" distR="0" simplePos="0" locked="0" layoutInCell="0" allowOverlap="1" relativeHeight="79">
+          <wp:anchor distT="0" distB="0" distL="0" distR="0" simplePos="0" relativeHeight="79" behindDoc="0" locked="0" layoutInCell="0" allowOverlap="1">
             <wp:simplePos x="0" y="0"/>
             <wp:positionH relativeFrom="column">
               <wp:posOffset>-28575</wp:posOffset>
@@ -27310,7 +27314,7 @@
       <w:r>
         <w:rPr/>
         <w:drawing>
-          <wp:anchor behindDoc="0" distT="0" distB="0" distL="0" distR="0" simplePos="0" locked="0" layoutInCell="0" allowOverlap="1" relativeHeight="80">
+          <wp:anchor distT="0" distB="0" distL="0" distR="0" simplePos="0" relativeHeight="80" behindDoc="0" locked="0" layoutInCell="0" allowOverlap="1">
             <wp:simplePos x="0" y="0"/>
             <wp:positionH relativeFrom="column">
               <wp:posOffset>86360</wp:posOffset>
@@ -27453,7 +27457,7 @@
       <w:r>
         <w:rPr/>
         <w:drawing>
-          <wp:anchor behindDoc="0" distT="0" distB="0" distL="0" distR="0" simplePos="0" locked="0" layoutInCell="0" allowOverlap="1" relativeHeight="81">
+          <wp:anchor distT="0" distB="0" distL="0" distR="0" simplePos="0" relativeHeight="81" behindDoc="0" locked="0" layoutInCell="0" allowOverlap="1">
             <wp:simplePos x="0" y="0"/>
             <wp:positionH relativeFrom="column">
               <wp:posOffset>21590</wp:posOffset>
@@ -27573,7 +27577,7 @@
       <w:r>
         <w:rPr/>
         <w:drawing>
-          <wp:anchor behindDoc="0" distT="0" distB="0" distL="0" distR="0" simplePos="0" locked="0" layoutInCell="0" allowOverlap="1" relativeHeight="82">
+          <wp:anchor distT="0" distB="0" distL="0" distR="0" simplePos="0" relativeHeight="82" behindDoc="0" locked="0" layoutInCell="0" allowOverlap="1">
             <wp:simplePos x="0" y="0"/>
             <wp:positionH relativeFrom="column">
               <wp:posOffset>-16510</wp:posOffset>
@@ -27655,7 +27659,7 @@
           <w:numId w:val="0"/>
         </w:numPr>
         <w:suppressAutoHyphens w:val="true"/>
-        <w:overflowPunct w:val="true"/>
+        <w:overflowPunct w:val="false"/>
         <w:ind w:hanging="0" w:left="0"/>
         <w:jc w:val="left"/>
         <w:rPr>
@@ -27702,7 +27706,7 @@
       <w:r>
         <w:rPr/>
         <w:drawing>
-          <wp:anchor behindDoc="0" distT="0" distB="0" distL="0" distR="0" simplePos="0" locked="0" layoutInCell="0" allowOverlap="1" relativeHeight="83">
+          <wp:anchor distT="0" distB="0" distL="0" distR="0" simplePos="0" relativeHeight="83" behindDoc="0" locked="0" layoutInCell="0" allowOverlap="1">
             <wp:simplePos x="0" y="0"/>
             <wp:positionH relativeFrom="column">
               <wp:posOffset>57785</wp:posOffset>
@@ -27900,7 +27904,7 @@
       <w:r>
         <w:rPr/>
         <w:drawing>
-          <wp:anchor behindDoc="0" distT="0" distB="0" distL="0" distR="0" simplePos="0" locked="0" layoutInCell="0" allowOverlap="1" relativeHeight="84">
+          <wp:anchor distT="0" distB="0" distL="0" distR="0" simplePos="0" relativeHeight="84" behindDoc="0" locked="0" layoutInCell="0" allowOverlap="1">
             <wp:simplePos x="0" y="0"/>
             <wp:positionH relativeFrom="column">
               <wp:posOffset>-17780</wp:posOffset>
@@ -28020,7 +28024,7 @@
       <w:r>
         <w:rPr/>
         <w:drawing>
-          <wp:anchor behindDoc="0" distT="0" distB="0" distL="0" distR="0" simplePos="0" locked="0" layoutInCell="0" allowOverlap="1" relativeHeight="85">
+          <wp:anchor distT="0" distB="0" distL="0" distR="0" simplePos="0" relativeHeight="85" behindDoc="0" locked="0" layoutInCell="0" allowOverlap="1">
             <wp:simplePos x="0" y="0"/>
             <wp:positionH relativeFrom="column">
               <wp:posOffset>-10795</wp:posOffset>
@@ -28110,7 +28114,7 @@
       <w:r>
         <w:rPr/>
         <w:drawing>
-          <wp:anchor behindDoc="0" distT="0" distB="0" distL="0" distR="0" simplePos="0" locked="0" layoutInCell="0" allowOverlap="1" relativeHeight="86">
+          <wp:anchor distT="0" distB="0" distL="0" distR="0" simplePos="0" relativeHeight="86" behindDoc="0" locked="0" layoutInCell="0" allowOverlap="1">
             <wp:simplePos x="0" y="0"/>
             <wp:positionH relativeFrom="column">
               <wp:posOffset>-10160</wp:posOffset>
@@ -28226,7 +28230,7 @@
           <w:numId w:val="0"/>
         </w:numPr>
         <w:suppressAutoHyphens w:val="true"/>
-        <w:overflowPunct w:val="true"/>
+        <w:overflowPunct w:val="false"/>
         <w:ind w:hanging="0" w:left="0"/>
         <w:jc w:val="left"/>
         <w:rPr>
@@ -29209,7 +29213,7 @@
       </w:pPr>
       <w:r>
         <w:drawing>
-          <wp:anchor behindDoc="0" distT="0" distB="0" distL="0" distR="0" simplePos="0" locked="0" layoutInCell="0" allowOverlap="1" relativeHeight="87">
+          <wp:anchor distT="0" distB="0" distL="0" distR="0" simplePos="0" relativeHeight="87" behindDoc="0" locked="0" layoutInCell="0" allowOverlap="1">
             <wp:simplePos x="0" y="0"/>
             <wp:positionH relativeFrom="column">
               <wp:posOffset>35560</wp:posOffset>
@@ -29255,7 +29259,7 @@
           </wp:anchor>
         </w:drawing>
         <w:drawing>
-          <wp:anchor behindDoc="0" distT="0" distB="0" distL="0" distR="0" simplePos="0" locked="0" layoutInCell="0" allowOverlap="1" relativeHeight="88">
+          <wp:anchor distT="0" distB="0" distL="0" distR="0" simplePos="0" relativeHeight="88" behindDoc="0" locked="0" layoutInCell="0" allowOverlap="1">
             <wp:simplePos x="0" y="0"/>
             <wp:positionH relativeFrom="column">
               <wp:posOffset>34290</wp:posOffset>
@@ -29421,7 +29425,7 @@
           <w:szCs w:val="20"/>
         </w:rPr>
         <w:drawing>
-          <wp:anchor behindDoc="0" distT="0" distB="0" distL="0" distR="0" simplePos="0" locked="0" layoutInCell="0" allowOverlap="1" relativeHeight="89">
+          <wp:anchor distT="0" distB="0" distL="0" distR="0" simplePos="0" relativeHeight="89" behindDoc="0" locked="0" layoutInCell="0" allowOverlap="1">
             <wp:simplePos x="0" y="0"/>
             <wp:positionH relativeFrom="column">
               <wp:posOffset>32385</wp:posOffset>
@@ -29514,7 +29518,7 @@
       <w:r>
         <w:rPr/>
         <w:drawing>
-          <wp:anchor behindDoc="0" distT="0" distB="0" distL="0" distR="0" simplePos="0" locked="0" layoutInCell="0" allowOverlap="1" relativeHeight="90">
+          <wp:anchor distT="0" distB="0" distL="0" distR="0" simplePos="0" relativeHeight="90" behindDoc="0" locked="0" layoutInCell="0" allowOverlap="1">
             <wp:simplePos x="0" y="0"/>
             <wp:positionH relativeFrom="column">
               <wp:posOffset>46990</wp:posOffset>
@@ -29573,7 +29577,7 @@
       <w:r>
         <w:rPr/>
         <w:drawing>
-          <wp:anchor behindDoc="0" distT="0" distB="0" distL="0" distR="0" simplePos="0" locked="0" layoutInCell="0" allowOverlap="1" relativeHeight="91">
+          <wp:anchor distT="0" distB="0" distL="0" distR="0" simplePos="0" relativeHeight="91" behindDoc="0" locked="0" layoutInCell="0" allowOverlap="1">
             <wp:simplePos x="0" y="0"/>
             <wp:positionH relativeFrom="column">
               <wp:posOffset>45085</wp:posOffset>
@@ -29663,7 +29667,7 @@
       <w:r>
         <w:rPr/>
         <w:drawing>
-          <wp:anchor behindDoc="0" distT="0" distB="0" distL="0" distR="0" simplePos="0" locked="0" layoutInCell="0" allowOverlap="1" relativeHeight="92">
+          <wp:anchor distT="0" distB="0" distL="0" distR="0" simplePos="0" relativeHeight="92" behindDoc="0" locked="0" layoutInCell="0" allowOverlap="1">
             <wp:simplePos x="0" y="0"/>
             <wp:positionH relativeFrom="column">
               <wp:posOffset>75565</wp:posOffset>
@@ -29795,7 +29799,7 @@
       <w:r>
         <w:rPr/>
         <w:drawing>
-          <wp:anchor behindDoc="0" distT="0" distB="0" distL="0" distR="0" simplePos="0" locked="0" layoutInCell="0" allowOverlap="1" relativeHeight="104">
+          <wp:anchor distT="0" distB="0" distL="0" distR="0" simplePos="0" relativeHeight="104" behindDoc="0" locked="0" layoutInCell="0" allowOverlap="1">
             <wp:simplePos x="0" y="0"/>
             <wp:positionH relativeFrom="column">
               <wp:posOffset>197485</wp:posOffset>
@@ -29851,7 +29855,7 @@
           <w:numId w:val="0"/>
         </w:numPr>
         <w:suppressAutoHyphens w:val="true"/>
-        <w:overflowPunct w:val="true"/>
+        <w:overflowPunct w:val="false"/>
         <w:bidi w:val="0"/>
         <w:ind w:hanging="0" w:left="0"/>
         <w:jc w:val="left"/>
@@ -29941,7 +29945,7 @@
       <w:r>
         <w:rPr/>
         <w:drawing>
-          <wp:anchor behindDoc="0" distT="0" distB="0" distL="0" distR="0" simplePos="0" locked="0" layoutInCell="0" allowOverlap="1" relativeHeight="95">
+          <wp:anchor distT="0" distB="0" distL="0" distR="0" simplePos="0" relativeHeight="95" behindDoc="0" locked="0" layoutInCell="0" allowOverlap="1">
             <wp:simplePos x="0" y="0"/>
             <wp:positionH relativeFrom="column">
               <wp:posOffset>28575</wp:posOffset>
@@ -30110,7 +30114,7 @@
       <w:r>
         <w:rPr/>
         <w:drawing>
-          <wp:anchor behindDoc="0" distT="0" distB="0" distL="0" distR="0" simplePos="0" locked="0" layoutInCell="0" allowOverlap="1" relativeHeight="70">
+          <wp:anchor distT="0" distB="0" distL="0" distR="0" simplePos="0" relativeHeight="70" behindDoc="0" locked="0" layoutInCell="0" allowOverlap="1">
             <wp:simplePos x="0" y="0"/>
             <wp:positionH relativeFrom="column">
               <wp:posOffset>90170</wp:posOffset>
@@ -30225,7 +30229,7 @@
       <w:r>
         <w:rPr/>
         <w:drawing>
-          <wp:anchor behindDoc="0" distT="0" distB="0" distL="0" distR="0" simplePos="0" locked="0" layoutInCell="0" allowOverlap="1" relativeHeight="17">
+          <wp:anchor distT="0" distB="0" distL="0" distR="0" simplePos="0" relativeHeight="17" behindDoc="0" locked="0" layoutInCell="0" allowOverlap="1">
             <wp:simplePos x="0" y="0"/>
             <wp:positionH relativeFrom="column">
               <wp:posOffset>-6985</wp:posOffset>
@@ -30347,7 +30351,7 @@
       </w:pPr>
       <w:r>
         <w:drawing>
-          <wp:anchor behindDoc="0" distT="0" distB="0" distL="0" distR="0" simplePos="0" locked="0" layoutInCell="0" allowOverlap="1" relativeHeight="18">
+          <wp:anchor distT="0" distB="0" distL="0" distR="0" simplePos="0" relativeHeight="18" behindDoc="0" locked="0" layoutInCell="0" allowOverlap="1">
             <wp:simplePos x="0" y="0"/>
             <wp:positionH relativeFrom="column">
               <wp:posOffset>-46990</wp:posOffset>
@@ -30481,7 +30485,7 @@
           <w:szCs w:val="20"/>
         </w:rPr>
         <w:drawing>
-          <wp:anchor behindDoc="0" distT="0" distB="0" distL="0" distR="0" simplePos="0" locked="0" layoutInCell="0" allowOverlap="1" relativeHeight="19">
+          <wp:anchor distT="0" distB="0" distL="0" distR="0" simplePos="0" relativeHeight="19" behindDoc="0" locked="0" layoutInCell="0" allowOverlap="1">
             <wp:simplePos x="0" y="0"/>
             <wp:positionH relativeFrom="column">
               <wp:posOffset>39370</wp:posOffset>
@@ -30841,7 +30845,7 @@
       </w:pPr>
       <w:r>
         <w:drawing>
-          <wp:anchor behindDoc="0" distT="0" distB="0" distL="0" distR="0" simplePos="0" locked="0" layoutInCell="0" allowOverlap="1" relativeHeight="20">
+          <wp:anchor distT="0" distB="0" distL="0" distR="0" simplePos="0" relativeHeight="20" behindDoc="0" locked="0" layoutInCell="0" allowOverlap="1">
             <wp:simplePos x="0" y="0"/>
             <wp:positionH relativeFrom="column">
               <wp:posOffset>-11430</wp:posOffset>
@@ -30939,7 +30943,7 @@
       </w:pPr>
       <w:r>
         <w:drawing>
-          <wp:anchor behindDoc="0" distT="0" distB="0" distL="0" distR="0" simplePos="0" locked="0" layoutInCell="0" allowOverlap="1" relativeHeight="21">
+          <wp:anchor distT="0" distB="0" distL="0" distR="0" simplePos="0" relativeHeight="21" behindDoc="0" locked="0" layoutInCell="0" allowOverlap="1">
             <wp:simplePos x="0" y="0"/>
             <wp:positionH relativeFrom="column">
               <wp:posOffset>16510</wp:posOffset>
@@ -31021,7 +31025,7 @@
       </w:pPr>
       <w:r>
         <w:drawing>
-          <wp:anchor behindDoc="0" distT="0" distB="0" distL="0" distR="0" simplePos="0" locked="0" layoutInCell="0" allowOverlap="1" relativeHeight="22">
+          <wp:anchor distT="0" distB="0" distL="0" distR="0" simplePos="0" relativeHeight="22" behindDoc="0" locked="0" layoutInCell="0" allowOverlap="1">
             <wp:simplePos x="0" y="0"/>
             <wp:positionH relativeFrom="column">
               <wp:posOffset>16510</wp:posOffset>
@@ -31105,7 +31109,7 @@
       </w:pPr>
       <w:r>
         <w:drawing>
-          <wp:anchor behindDoc="0" distT="0" distB="0" distL="0" distR="0" simplePos="0" locked="0" layoutInCell="0" allowOverlap="1" relativeHeight="23">
+          <wp:anchor distT="0" distB="0" distL="0" distR="0" simplePos="0" relativeHeight="23" behindDoc="0" locked="0" layoutInCell="0" allowOverlap="1">
             <wp:simplePos x="0" y="0"/>
             <wp:positionH relativeFrom="column">
               <wp:posOffset>3810</wp:posOffset>
@@ -31188,7 +31192,7 @@
       </w:pPr>
       <w:r>
         <w:drawing>
-          <wp:anchor behindDoc="0" distT="0" distB="0" distL="0" distR="0" simplePos="0" locked="0" layoutInCell="0" allowOverlap="1" relativeHeight="24">
+          <wp:anchor distT="0" distB="0" distL="0" distR="0" simplePos="0" relativeHeight="24" behindDoc="0" locked="0" layoutInCell="0" allowOverlap="1">
             <wp:simplePos x="0" y="0"/>
             <wp:positionH relativeFrom="column">
               <wp:posOffset>0</wp:posOffset>
@@ -31272,7 +31276,7 @@
       <w:r>
         <w:rPr/>
         <w:drawing>
-          <wp:anchor behindDoc="0" distT="0" distB="0" distL="0" distR="0" simplePos="0" locked="0" layoutInCell="0" allowOverlap="1" relativeHeight="25">
+          <wp:anchor distT="0" distB="0" distL="0" distR="0" simplePos="0" relativeHeight="25" behindDoc="0" locked="0" layoutInCell="0" allowOverlap="1">
             <wp:simplePos x="0" y="0"/>
             <wp:positionH relativeFrom="column">
               <wp:posOffset>-10795</wp:posOffset>
@@ -31572,7 +31576,7 @@
       <w:r>
         <w:rPr/>
         <w:drawing>
-          <wp:anchor behindDoc="0" distT="0" distB="0" distL="0" distR="0" simplePos="0" locked="0" layoutInCell="0" allowOverlap="1" relativeHeight="26">
+          <wp:anchor distT="0" distB="0" distL="0" distR="0" simplePos="0" relativeHeight="26" behindDoc="0" locked="0" layoutInCell="0" allowOverlap="1">
             <wp:simplePos x="0" y="0"/>
             <wp:positionH relativeFrom="column">
               <wp:posOffset>-3810</wp:posOffset>
@@ -31672,7 +31676,7 @@
           <w:numId w:val="0"/>
         </w:numPr>
         <w:suppressAutoHyphens w:val="true"/>
-        <w:overflowPunct w:val="true"/>
+        <w:overflowPunct w:val="false"/>
         <w:ind w:hanging="0" w:left="0"/>
         <w:jc w:val="left"/>
         <w:rPr>
@@ -31719,7 +31723,7 @@
       <w:r>
         <w:rPr/>
         <w:drawing>
-          <wp:anchor behindDoc="0" distT="0" distB="0" distL="0" distR="0" simplePos="0" locked="0" layoutInCell="0" allowOverlap="1" relativeHeight="97">
+          <wp:anchor distT="0" distB="0" distL="0" distR="0" simplePos="0" relativeHeight="97" behindDoc="0" locked="0" layoutInCell="0" allowOverlap="1">
             <wp:simplePos x="0" y="0"/>
             <wp:positionH relativeFrom="column">
               <wp:posOffset>39370</wp:posOffset>
@@ -33026,7 +33030,7 @@
       <w:r>
         <w:rPr/>
         <w:drawing>
-          <wp:anchor behindDoc="0" distT="0" distB="0" distL="0" distR="0" simplePos="0" locked="0" layoutInCell="0" allowOverlap="1" relativeHeight="27">
+          <wp:anchor distT="0" distB="0" distL="0" distR="0" simplePos="0" relativeHeight="27" behindDoc="0" locked="0" layoutInCell="0" allowOverlap="1">
             <wp:simplePos x="0" y="0"/>
             <wp:positionH relativeFrom="column">
               <wp:posOffset>-21590</wp:posOffset>
@@ -33103,7 +33107,7 @@
       <w:r>
         <w:rPr/>
         <w:drawing>
-          <wp:anchor behindDoc="0" distT="0" distB="0" distL="0" distR="0" simplePos="0" locked="0" layoutInCell="0" allowOverlap="1" relativeHeight="28">
+          <wp:anchor distT="0" distB="0" distL="0" distR="0" simplePos="0" relativeHeight="28" behindDoc="0" locked="0" layoutInCell="0" allowOverlap="1">
             <wp:simplePos x="0" y="0"/>
             <wp:positionH relativeFrom="column">
               <wp:posOffset>46990</wp:posOffset>
@@ -33203,7 +33207,7 @@
           <w:numId w:val="0"/>
         </w:numPr>
         <w:suppressAutoHyphens w:val="true"/>
-        <w:overflowPunct w:val="true"/>
+        <w:overflowPunct w:val="false"/>
         <w:ind w:hanging="0" w:left="0"/>
         <w:jc w:val="left"/>
         <w:rPr>
@@ -33263,7 +33267,7 @@
       <w:r>
         <w:rPr/>
         <w:drawing>
-          <wp:anchor behindDoc="0" distT="0" distB="0" distL="0" distR="0" simplePos="0" locked="0" layoutInCell="0" allowOverlap="1" relativeHeight="29">
+          <wp:anchor distT="0" distB="0" distL="0" distR="0" simplePos="0" relativeHeight="29" behindDoc="0" locked="0" layoutInCell="0" allowOverlap="1">
             <wp:simplePos x="0" y="0"/>
             <wp:positionH relativeFrom="column">
               <wp:posOffset>3810</wp:posOffset>
@@ -33335,7 +33339,7 @@
       <w:r>
         <w:rPr/>
         <w:drawing>
-          <wp:anchor behindDoc="0" distT="0" distB="0" distL="0" distR="0" simplePos="0" locked="0" layoutInCell="0" allowOverlap="1" relativeHeight="30">
+          <wp:anchor distT="0" distB="0" distL="0" distR="0" simplePos="0" relativeHeight="30" behindDoc="0" locked="0" layoutInCell="0" allowOverlap="1">
             <wp:simplePos x="0" y="0"/>
             <wp:positionH relativeFrom="column">
               <wp:posOffset>17780</wp:posOffset>
@@ -33446,7 +33450,7 @@
           <w:szCs w:val="20"/>
         </w:rPr>
         <w:drawing>
-          <wp:anchor behindDoc="0" distT="0" distB="0" distL="0" distR="0" simplePos="0" locked="0" layoutInCell="0" allowOverlap="1" relativeHeight="31">
+          <wp:anchor distT="0" distB="0" distL="0" distR="0" simplePos="0" relativeHeight="31" behindDoc="0" locked="0" layoutInCell="0" allowOverlap="1">
             <wp:simplePos x="0" y="0"/>
             <wp:positionH relativeFrom="column">
               <wp:posOffset>64770</wp:posOffset>
@@ -33567,7 +33571,7 @@
       <w:r>
         <w:rPr/>
         <w:drawing>
-          <wp:anchor behindDoc="0" distT="0" distB="0" distL="0" distR="0" simplePos="0" locked="0" layoutInCell="0" allowOverlap="1" relativeHeight="100">
+          <wp:anchor distT="0" distB="0" distL="0" distR="0" simplePos="0" relativeHeight="100" behindDoc="0" locked="0" layoutInCell="0" allowOverlap="1">
             <wp:simplePos x="0" y="0"/>
             <wp:positionH relativeFrom="column">
               <wp:posOffset>635</wp:posOffset>
@@ -33613,7 +33617,7 @@
           </wp:anchor>
         </w:drawing>
         <w:drawing>
-          <wp:anchor behindDoc="0" distT="0" distB="0" distL="0" distR="0" simplePos="0" locked="0" layoutInCell="0" allowOverlap="1" relativeHeight="101">
+          <wp:anchor distT="0" distB="0" distL="0" distR="0" simplePos="0" relativeHeight="101" behindDoc="0" locked="0" layoutInCell="0" allowOverlap="1">
             <wp:simplePos x="0" y="0"/>
             <wp:positionH relativeFrom="column">
               <wp:posOffset>125730</wp:posOffset>
@@ -33732,7 +33736,7 @@
           <w:szCs w:val="20"/>
         </w:rPr>
         <w:drawing>
-          <wp:anchor behindDoc="0" distT="0" distB="0" distL="0" distR="0" simplePos="0" locked="0" layoutInCell="0" allowOverlap="1" relativeHeight="32">
+          <wp:anchor distT="0" distB="0" distL="0" distR="0" simplePos="0" relativeHeight="32" behindDoc="0" locked="0" layoutInCell="0" allowOverlap="1">
             <wp:simplePos x="0" y="0"/>
             <wp:positionH relativeFrom="column">
               <wp:posOffset>68580</wp:posOffset>
@@ -33882,7 +33886,7 @@
       <w:r>
         <w:rPr/>
         <w:drawing>
-          <wp:anchor behindDoc="0" distT="0" distB="0" distL="0" distR="0" simplePos="0" locked="0" layoutInCell="0" allowOverlap="1" relativeHeight="33">
+          <wp:anchor distT="0" distB="0" distL="0" distR="0" simplePos="0" relativeHeight="33" behindDoc="0" locked="0" layoutInCell="0" allowOverlap="1">
             <wp:simplePos x="0" y="0"/>
             <wp:positionH relativeFrom="column">
               <wp:posOffset>0</wp:posOffset>
@@ -34279,7 +34283,7 @@
       <w:r>
         <w:rPr/>
         <w:drawing>
-          <wp:anchor behindDoc="0" distT="0" distB="0" distL="0" distR="0" simplePos="0" locked="0" layoutInCell="0" allowOverlap="1" relativeHeight="34">
+          <wp:anchor distT="0" distB="0" distL="0" distR="0" simplePos="0" relativeHeight="34" behindDoc="0" locked="0" layoutInCell="0" allowOverlap="1">
             <wp:simplePos x="0" y="0"/>
             <wp:positionH relativeFrom="column">
               <wp:posOffset>-17780</wp:posOffset>
@@ -35414,7 +35418,7 @@
           </w:tcPr>
           <w:p>
             <w:pPr>
-              <w:pStyle w:val="Tabelleninhaltuser"/>
+              <w:pStyle w:val="Tabelleninhalt"/>
               <w:widowControl w:val="false"/>
               <w:jc w:val="left"/>
               <w:rPr>
@@ -35501,7 +35505,7 @@
           </w:tcPr>
           <w:p>
             <w:pPr>
-              <w:pStyle w:val="Tabelleninhaltuser"/>
+              <w:pStyle w:val="Tabelleninhalt"/>
               <w:widowControl w:val="false"/>
               <w:jc w:val="left"/>
               <w:rPr>
@@ -35588,7 +35592,7 @@
           </w:tcPr>
           <w:p>
             <w:pPr>
-              <w:pStyle w:val="Tabelleninhaltuser"/>
+              <w:pStyle w:val="Tabelleninhalt"/>
               <w:widowControl w:val="false"/>
               <w:jc w:val="left"/>
               <w:rPr>
@@ -35675,7 +35679,7 @@
           </w:tcPr>
           <w:p>
             <w:pPr>
-              <w:pStyle w:val="Tabelleninhaltuser"/>
+              <w:pStyle w:val="Tabelleninhalt"/>
               <w:widowControl w:val="false"/>
               <w:jc w:val="left"/>
               <w:rPr>
@@ -35762,7 +35766,7 @@
           </w:tcPr>
           <w:p>
             <w:pPr>
-              <w:pStyle w:val="Tabelleninhaltuser"/>
+              <w:pStyle w:val="Tabelleninhalt"/>
               <w:widowControl w:val="false"/>
               <w:jc w:val="left"/>
               <w:rPr>
@@ -35849,7 +35853,7 @@
           </w:tcPr>
           <w:p>
             <w:pPr>
-              <w:pStyle w:val="Tabelleninhaltuser"/>
+              <w:pStyle w:val="Tabelleninhalt"/>
               <w:widowControl w:val="false"/>
               <w:jc w:val="left"/>
               <w:rPr>
@@ -35936,7 +35940,7 @@
           </w:tcPr>
           <w:p>
             <w:pPr>
-              <w:pStyle w:val="Tabelleninhaltuser"/>
+              <w:pStyle w:val="Tabelleninhalt"/>
               <w:widowControl w:val="false"/>
               <w:jc w:val="left"/>
               <w:rPr>
@@ -36023,7 +36027,7 @@
           </w:tcPr>
           <w:p>
             <w:pPr>
-              <w:pStyle w:val="Tabelleninhaltuser"/>
+              <w:pStyle w:val="Tabelleninhalt"/>
               <w:widowControl w:val="false"/>
               <w:jc w:val="left"/>
               <w:rPr>
@@ -36110,7 +36114,7 @@
           </w:tcPr>
           <w:p>
             <w:pPr>
-              <w:pStyle w:val="Tabelleninhaltuser"/>
+              <w:pStyle w:val="Tabelleninhalt"/>
               <w:widowControl w:val="false"/>
               <w:jc w:val="left"/>
               <w:rPr>
@@ -36197,7 +36201,7 @@
           </w:tcPr>
           <w:p>
             <w:pPr>
-              <w:pStyle w:val="Tabelleninhaltuser"/>
+              <w:pStyle w:val="Tabelleninhalt"/>
               <w:widowControl w:val="false"/>
               <w:jc w:val="left"/>
               <w:rPr>
@@ -36284,7 +36288,7 @@
           </w:tcPr>
           <w:p>
             <w:pPr>
-              <w:pStyle w:val="Tabelleninhaltuser"/>
+              <w:pStyle w:val="Tabelleninhalt"/>
               <w:widowControl w:val="false"/>
               <w:jc w:val="left"/>
               <w:rPr>
@@ -36371,7 +36375,7 @@
           </w:tcPr>
           <w:p>
             <w:pPr>
-              <w:pStyle w:val="Tabelleninhaltuser"/>
+              <w:pStyle w:val="Tabelleninhalt"/>
               <w:widowControl w:val="false"/>
               <w:jc w:val="left"/>
               <w:rPr>
@@ -36458,7 +36462,7 @@
           </w:tcPr>
           <w:p>
             <w:pPr>
-              <w:pStyle w:val="Tabelleninhaltuser"/>
+              <w:pStyle w:val="Tabelleninhalt"/>
               <w:widowControl w:val="false"/>
               <w:jc w:val="left"/>
               <w:rPr>
@@ -36545,7 +36549,7 @@
           </w:tcPr>
           <w:p>
             <w:pPr>
-              <w:pStyle w:val="Tabelleninhaltuser"/>
+              <w:pStyle w:val="Tabelleninhalt"/>
               <w:widowControl w:val="false"/>
               <w:jc w:val="left"/>
               <w:rPr>
@@ -36632,7 +36636,7 @@
           </w:tcPr>
           <w:p>
             <w:pPr>
-              <w:pStyle w:val="Tabelleninhaltuser"/>
+              <w:pStyle w:val="Tabelleninhalt"/>
               <w:widowControl w:val="false"/>
               <w:jc w:val="left"/>
               <w:rPr>
@@ -36719,7 +36723,7 @@
           </w:tcPr>
           <w:p>
             <w:pPr>
-              <w:pStyle w:val="Tabelleninhaltuser"/>
+              <w:pStyle w:val="Tabelleninhalt"/>
               <w:widowControl w:val="false"/>
               <w:jc w:val="left"/>
               <w:rPr>
@@ -36806,7 +36810,7 @@
           </w:tcPr>
           <w:p>
             <w:pPr>
-              <w:pStyle w:val="Tabelleninhaltuser"/>
+              <w:pStyle w:val="Tabelleninhalt"/>
               <w:widowControl w:val="false"/>
               <w:jc w:val="left"/>
               <w:rPr>
@@ -36893,7 +36897,7 @@
           </w:tcPr>
           <w:p>
             <w:pPr>
-              <w:pStyle w:val="Tabelleninhaltuser"/>
+              <w:pStyle w:val="Tabelleninhalt"/>
               <w:widowControl w:val="false"/>
               <w:jc w:val="left"/>
               <w:rPr>
@@ -36980,7 +36984,7 @@
           </w:tcPr>
           <w:p>
             <w:pPr>
-              <w:pStyle w:val="Tabelleninhaltuser"/>
+              <w:pStyle w:val="Tabelleninhalt"/>
               <w:widowControl w:val="false"/>
               <w:jc w:val="left"/>
               <w:rPr>
@@ -37067,7 +37071,7 @@
           </w:tcPr>
           <w:p>
             <w:pPr>
-              <w:pStyle w:val="Tabelleninhaltuser"/>
+              <w:pStyle w:val="Tabelleninhalt"/>
               <w:widowControl w:val="false"/>
               <w:jc w:val="left"/>
               <w:rPr>
@@ -37154,7 +37158,7 @@
           </w:tcPr>
           <w:p>
             <w:pPr>
-              <w:pStyle w:val="Tabelleninhaltuser"/>
+              <w:pStyle w:val="Tabelleninhalt"/>
               <w:widowControl w:val="false"/>
               <w:jc w:val="left"/>
               <w:rPr>
@@ -37241,7 +37245,7 @@
           </w:tcPr>
           <w:p>
             <w:pPr>
-              <w:pStyle w:val="Tabelleninhaltuser"/>
+              <w:pStyle w:val="Tabelleninhalt"/>
               <w:widowControl w:val="false"/>
               <w:jc w:val="left"/>
               <w:rPr>
@@ -37328,7 +37332,7 @@
           </w:tcPr>
           <w:p>
             <w:pPr>
-              <w:pStyle w:val="Tabelleninhaltuser"/>
+              <w:pStyle w:val="Tabelleninhalt"/>
               <w:widowControl w:val="false"/>
               <w:jc w:val="left"/>
               <w:rPr>
@@ -37415,7 +37419,7 @@
           </w:tcPr>
           <w:p>
             <w:pPr>
-              <w:pStyle w:val="Tabelleninhaltuser"/>
+              <w:pStyle w:val="Tabelleninhalt"/>
               <w:widowControl w:val="false"/>
               <w:jc w:val="left"/>
               <w:rPr>
@@ -37952,7 +37956,7 @@
         <w:pStyle w:val="Normal"/>
         <w:widowControl/>
         <w:suppressAutoHyphens w:val="true"/>
-        <w:overflowPunct w:val="true"/>
+        <w:overflowPunct w:val="false"/>
         <w:bidi w:val="0"/>
         <w:spacing w:before="0" w:after="0"/>
         <w:jc w:val="left"/>
@@ -38007,7 +38011,7 @@
       <w:r>
         <w:rPr/>
         <w:drawing>
-          <wp:anchor behindDoc="0" distT="0" distB="0" distL="0" distR="0" simplePos="0" locked="0" layoutInCell="0" allowOverlap="1" relativeHeight="35">
+          <wp:anchor distT="0" distB="0" distL="0" distR="0" simplePos="0" relativeHeight="35" behindDoc="0" locked="0" layoutInCell="0" allowOverlap="1">
             <wp:simplePos x="0" y="0"/>
             <wp:positionH relativeFrom="column">
               <wp:posOffset>60960</wp:posOffset>
@@ -38146,7 +38150,7 @@
       <w:ins w:id="184" w:author="Unbekannter Autor" w:date="2024-09-16T14:58:55Z">
         <w:r>
           <w:drawing>
-            <wp:anchor behindDoc="0" distT="0" distB="0" distL="0" distR="0" simplePos="0" locked="0" layoutInCell="0" allowOverlap="1" relativeHeight="105">
+            <wp:anchor distT="0" distB="0" distL="0" distR="0" simplePos="0" relativeHeight="105" behindDoc="0" locked="0" layoutInCell="0" allowOverlap="1">
               <wp:simplePos x="0" y="0"/>
               <wp:positionH relativeFrom="column">
                 <wp:posOffset>-3810</wp:posOffset>
@@ -38291,7 +38295,7 @@
       <w:ins w:id="195" w:author="Unbekannter Autor" w:date="2024-09-16T14:58:55Z">
         <w:r>
           <w:drawing>
-            <wp:anchor behindDoc="0" distT="0" distB="0" distL="0" distR="0" simplePos="0" locked="0" layoutInCell="0" allowOverlap="1" relativeHeight="106">
+            <wp:anchor distT="0" distB="0" distL="0" distR="0" simplePos="0" relativeHeight="106" behindDoc="0" locked="0" layoutInCell="0" allowOverlap="1">
               <wp:simplePos x="0" y="0"/>
               <wp:positionH relativeFrom="column">
                 <wp:posOffset>161925</wp:posOffset>
@@ -38422,7 +38426,7 @@
           <w:numId w:val="0"/>
         </w:numPr>
         <w:suppressAutoHyphens w:val="true"/>
-        <w:overflowPunct w:val="true"/>
+        <w:overflowPunct w:val="false"/>
         <w:ind w:hanging="0" w:left="0"/>
         <w:jc w:val="left"/>
         <w:rPr>
@@ -38474,7 +38478,7 @@
       <w:r>
         <w:rPr/>
         <w:drawing>
-          <wp:anchor behindDoc="0" distT="0" distB="0" distL="0" distR="0" simplePos="0" locked="0" layoutInCell="0" allowOverlap="1" relativeHeight="36">
+          <wp:anchor distT="0" distB="0" distL="0" distR="0" simplePos="0" relativeHeight="36" behindDoc="0" locked="0" layoutInCell="0" allowOverlap="1">
             <wp:simplePos x="0" y="0"/>
             <wp:positionH relativeFrom="column">
               <wp:posOffset>46990</wp:posOffset>
@@ -38811,7 +38815,7 @@
       <w:r>
         <w:rPr/>
         <w:drawing>
-          <wp:anchor behindDoc="0" distT="0" distB="0" distL="0" distR="0" simplePos="0" locked="0" layoutInCell="0" allowOverlap="1" relativeHeight="103">
+          <wp:anchor distT="0" distB="0" distL="0" distR="0" simplePos="0" relativeHeight="103" behindDoc="0" locked="0" layoutInCell="0" allowOverlap="1">
             <wp:simplePos x="0" y="0"/>
             <wp:positionH relativeFrom="column">
               <wp:posOffset>25400</wp:posOffset>
@@ -39143,7 +39147,7 @@
           <w:numId w:val="0"/>
         </w:numPr>
         <w:suppressAutoHyphens w:val="true"/>
-        <w:overflowPunct w:val="true"/>
+        <w:overflowPunct w:val="false"/>
         <w:ind w:hanging="0" w:left="0"/>
         <w:jc w:val="left"/>
         <w:rPr>
@@ -40231,7 +40235,7 @@
     </w:p>
     <w:p>
       <w:pPr>
-        <w:pStyle w:val="VorformatierterTextuser"/>
+        <w:pStyle w:val="VorformatierterText"/>
         <w:numPr>
           <w:ilvl w:val="0"/>
           <w:numId w:val="29"/>
@@ -40250,7 +40254,7 @@
     </w:p>
     <w:p>
       <w:pPr>
-        <w:pStyle w:val="VorformatierterTextuser"/>
+        <w:pStyle w:val="VorformatierterText"/>
         <w:bidi w:val="0"/>
         <w:spacing w:before="0" w:after="0"/>
         <w:jc w:val="left"/>
@@ -40262,7 +40266,7 @@
     </w:p>
     <w:p>
       <w:pPr>
-        <w:pStyle w:val="VorformatierterTextuser"/>
+        <w:pStyle w:val="VorformatierterText"/>
         <w:numPr>
           <w:ilvl w:val="0"/>
           <w:numId w:val="29"/>
@@ -40281,7 +40285,7 @@
     </w:p>
     <w:p>
       <w:pPr>
-        <w:pStyle w:val="VorformatierterTextuser"/>
+        <w:pStyle w:val="VorformatierterText"/>
         <w:bidi w:val="0"/>
         <w:spacing w:before="0" w:after="0"/>
         <w:jc w:val="left"/>
@@ -40293,7 +40297,7 @@
     </w:p>
     <w:p>
       <w:pPr>
-        <w:pStyle w:val="VorformatierterTextuser"/>
+        <w:pStyle w:val="VorformatierterText"/>
         <w:numPr>
           <w:ilvl w:val="0"/>
           <w:numId w:val="29"/>
@@ -40312,7 +40316,7 @@
     </w:p>
     <w:p>
       <w:pPr>
-        <w:pStyle w:val="VorformatierterTextuser"/>
+        <w:pStyle w:val="VorformatierterText"/>
         <w:bidi w:val="0"/>
         <w:spacing w:before="0" w:after="0"/>
         <w:jc w:val="left"/>
@@ -40324,7 +40328,7 @@
     </w:p>
     <w:p>
       <w:pPr>
-        <w:pStyle w:val="VorformatierterTextuser"/>
+        <w:pStyle w:val="VorformatierterText"/>
         <w:numPr>
           <w:ilvl w:val="0"/>
           <w:numId w:val="29"/>
@@ -40348,7 +40352,7 @@
     </w:p>
     <w:p>
       <w:pPr>
-        <w:pStyle w:val="VorformatierterTextuser"/>
+        <w:pStyle w:val="VorformatierterText"/>
         <w:bidi w:val="0"/>
         <w:spacing w:before="0" w:after="0"/>
         <w:jc w:val="left"/>
@@ -40366,7 +40370,7 @@
     </w:p>
     <w:p>
       <w:pPr>
-        <w:pStyle w:val="VorformatierterTextuser"/>
+        <w:pStyle w:val="VorformatierterText"/>
         <w:bidi w:val="0"/>
         <w:spacing w:before="0" w:after="0"/>
         <w:jc w:val="left"/>
@@ -45846,7 +45850,7 @@
     <w:pPr>
       <w:widowControl/>
       <w:suppressAutoHyphens w:val="true"/>
-      <w:overflowPunct w:val="true"/>
+      <w:overflowPunct w:val="false"/>
       <w:bidi w:val="0"/>
       <w:spacing w:before="0" w:after="0"/>
       <w:jc w:val="left"/>
@@ -45862,7 +45866,7 @@
   </w:style>
   <w:style w:type="paragraph" w:styleId="Heading1">
     <w:name w:val="heading 1"/>
-    <w:basedOn w:val="berschriftuser"/>
+    <w:basedOn w:val="berschrift"/>
     <w:next w:val="BodyText"/>
     <w:qFormat/>
     <w:pPr>
@@ -45882,7 +45886,7 @@
   </w:style>
   <w:style w:type="paragraph" w:styleId="Heading2">
     <w:name w:val="heading 2"/>
-    <w:basedOn w:val="berschriftuser"/>
+    <w:basedOn w:val="berschrift"/>
     <w:next w:val="BodyText"/>
     <w:qFormat/>
     <w:pPr>
@@ -45902,7 +45906,7 @@
   </w:style>
   <w:style w:type="paragraph" w:styleId="Heading3">
     <w:name w:val="heading 3"/>
-    <w:basedOn w:val="berschriftuser"/>
+    <w:basedOn w:val="berschrift"/>
     <w:next w:val="BodyText"/>
     <w:qFormat/>
     <w:pPr>
@@ -45922,7 +45926,7 @@
   </w:style>
   <w:style w:type="paragraph" w:styleId="Heading4">
     <w:name w:val="heading 4"/>
-    <w:basedOn w:val="berschriftuser"/>
+    <w:basedOn w:val="berschrift"/>
     <w:next w:val="BodyText"/>
     <w:qFormat/>
     <w:pPr>
@@ -45942,8 +45946,8 @@
       <w:szCs w:val="26"/>
     </w:rPr>
   </w:style>
-  <w:style w:type="character" w:styleId="Aufzhlungszeichenuser">
-    <w:name w:val="Aufzählungszeichen (user)"/>
+  <w:style w:type="character" w:styleId="Aufzhlungszeichen">
+    <w:name w:val="Aufzählungszeichen"/>
     <w:qFormat/>
     <w:rPr>
       <w:rFonts w:ascii="OpenSymbol" w:hAnsi="OpenSymbol" w:eastAsia="OpenSymbol" w:cs="OpenSymbol"/>
@@ -45958,13 +45962,13 @@
       <w:lang w:val="zxx" w:eastAsia="zxx" w:bidi="zxx"/>
     </w:rPr>
   </w:style>
-  <w:style w:type="character" w:styleId="Verzeichnissprunguser">
-    <w:name w:val="Verzeichnissprung (user)"/>
+  <w:style w:type="character" w:styleId="Verzeichnissprung">
+    <w:name w:val="Verzeichnissprung"/>
     <w:qFormat/>
     <w:rPr/>
   </w:style>
-  <w:style w:type="character" w:styleId="Nummerierungszeichenuser">
-    <w:name w:val="Nummerierungszeichen (user)"/>
+  <w:style w:type="character" w:styleId="Nummerierungszeichen">
+    <w:name w:val="Nummerierungszeichen"/>
     <w:qFormat/>
     <w:rPr>
       <w:rFonts w:ascii="Arial" w:hAnsi="Arial"/>
@@ -46038,8 +46042,8 @@
       <w:u w:val="single"/>
     </w:rPr>
   </w:style>
-  <w:style w:type="character" w:styleId="Verzeichnissprung">
-    <w:name w:val="Verzeichnissprung"/>
+  <w:style w:type="character" w:styleId="Verzeichnissprunguser">
+    <w:name w:val="Verzeichnissprung (user)"/>
     <w:qFormat/>
     <w:rPr/>
   </w:style>
@@ -46047,8 +46051,8 @@
     <w:name w:val="line number"/>
     <w:rPr/>
   </w:style>
-  <w:style w:type="character" w:styleId="Aufzhlungszeichen">
-    <w:name w:val="Aufzählungszeichen"/>
+  <w:style w:type="character" w:styleId="Aufzhlungszeichenuser">
+    <w:name w:val="Aufzählungszeichen (user)"/>
     <w:qFormat/>
     <w:rPr>
       <w:rFonts w:ascii="OpenSymbol" w:hAnsi="OpenSymbol" w:eastAsia="OpenSymbol" w:cs="OpenSymbol"/>
@@ -46152,15 +46156,15 @@
     </w:pPr>
     <w:rPr/>
   </w:style>
-  <w:style w:type="paragraph" w:styleId="Kopf-Fuzeileuser">
-    <w:name w:val="Kopf-/Fußzeile (user)"/>
+  <w:style w:type="paragraph" w:styleId="Kopf-Fuzeile">
+    <w:name w:val="Kopf-/Fußzeile"/>
     <w:basedOn w:val="Normal"/>
     <w:qFormat/>
     <w:pPr/>
     <w:rPr/>
   </w:style>
-  <w:style w:type="paragraph" w:styleId="Kopf-Fuzeile">
-    <w:name w:val="Kopf-/Fußzeile"/>
+  <w:style w:type="paragraph" w:styleId="Kopf-Fuzeileuser">
+    <w:name w:val="Kopf-/Fußzeile (user)"/>
     <w:basedOn w:val="Normal"/>
     <w:qFormat/>
     <w:pPr/>
@@ -46176,7 +46180,7 @@
   </w:style>
   <w:style w:type="paragraph" w:styleId="IndexHeading">
     <w:name w:val="index heading"/>
-    <w:basedOn w:val="berschriftuser"/>
+    <w:basedOn w:val="berschrift"/>
     <w:pPr>
       <w:suppressLineNumbers/>
       <w:ind w:hanging="0" w:left="0"/>
@@ -46205,7 +46209,7 @@
   </w:style>
   <w:style w:type="paragraph" w:styleId="TOC1">
     <w:name w:val="toc 1"/>
-    <w:basedOn w:val="Verzeichnisuser"/>
+    <w:basedOn w:val="Verzeichnis"/>
     <w:pPr>
       <w:tabs>
         <w:tab w:val="clear" w:pos="709"/>
@@ -46220,7 +46224,7 @@
   </w:style>
   <w:style w:type="paragraph" w:styleId="TOC2">
     <w:name w:val="toc 2"/>
-    <w:basedOn w:val="Verzeichnisuser"/>
+    <w:basedOn w:val="Verzeichnis"/>
     <w:pPr>
       <w:tabs>
         <w:tab w:val="clear" w:pos="709"/>
@@ -46235,7 +46239,7 @@
   </w:style>
   <w:style w:type="paragraph" w:styleId="TOC3">
     <w:name w:val="toc 3"/>
-    <w:basedOn w:val="Verzeichnisuser"/>
+    <w:basedOn w:val="Verzeichnis"/>
     <w:pPr>
       <w:tabs>
         <w:tab w:val="clear" w:pos="709"/>
@@ -46250,7 +46254,7 @@
   </w:style>
   <w:style w:type="paragraph" w:styleId="TOC4">
     <w:name w:val="toc 4"/>
-    <w:basedOn w:val="Verzeichnisuser"/>
+    <w:basedOn w:val="Verzeichnis"/>
     <w:pPr>
       <w:tabs>
         <w:tab w:val="clear" w:pos="709"/>
@@ -46260,8 +46264,8 @@
     </w:pPr>
     <w:rPr/>
   </w:style>
-  <w:style w:type="paragraph" w:styleId="Tabelleninhaltuser">
-    <w:name w:val="Tabelleninhalt (user)"/>
+  <w:style w:type="paragraph" w:styleId="Tabelleninhalt">
+    <w:name w:val="Tabelleninhalt"/>
     <w:basedOn w:val="Normal"/>
     <w:qFormat/>
     <w:pPr>
@@ -46270,9 +46274,9 @@
     </w:pPr>
     <w:rPr/>
   </w:style>
-  <w:style w:type="paragraph" w:styleId="Tabellenberschriftuser">
-    <w:name w:val="Tabellenüberschrift (user)"/>
-    <w:basedOn w:val="Tabelleninhaltuser"/>
+  <w:style w:type="paragraph" w:styleId="Tabellenberschrift">
+    <w:name w:val="Tabellenüberschrift"/>
+    <w:basedOn w:val="Tabelleninhalt"/>
     <w:qFormat/>
     <w:pPr>
       <w:suppressLineNumbers/>
@@ -46283,8 +46287,8 @@
       <w:bCs/>
     </w:rPr>
   </w:style>
-  <w:style w:type="paragraph" w:styleId="VorformatierterTextuser">
-    <w:name w:val="Vorformatierter Text (user)"/>
+  <w:style w:type="paragraph" w:styleId="VorformatierterText">
+    <w:name w:val="Vorformatierter Text"/>
     <w:basedOn w:val="Normal"/>
     <w:qFormat/>
     <w:pPr>

</xml_diff>